<commit_message>
Final EIS for the night
</commit_message>
<xml_diff>
--- a/doc/Colorado_River_EIS_Millard_Suckla.docx
+++ b/doc/Colorado_River_EIS_Millard_Suckla.docx
@@ -93,38 +93,20 @@
         <w:rPr>
           <w:sz w:val="28"/>
         </w:rPr>
-        <w:t xml:space="preserve">Date: </w:t>
-      </w:r>
+        <w:t>Date: February 28, 2026</w:t>
+      </w:r>
+    </w:p>
+    <w:p>
+      <w:pPr>
+        <w:pStyle w:val="Normal"/>
+        <w:jc w:val="center"/>
+        <w:rPr/>
+      </w:pPr>
       <w:r>
         <w:rPr>
           <w:sz w:val="28"/>
         </w:rPr>
-        <w:t>February 28</w:t>
-      </w:r>
-      <w:r>
-        <w:rPr>
-          <w:sz w:val="28"/>
-        </w:rPr>
-        <w:t>, 2026</w:t>
-      </w:r>
-    </w:p>
-    <w:p>
-      <w:pPr>
-        <w:pStyle w:val="Normal"/>
-        <w:jc w:val="center"/>
-        <w:rPr/>
-      </w:pPr>
-      <w:r>
-        <w:rPr>
-          <w:sz w:val="28"/>
-        </w:rPr>
-        <w:t>Version  1.3</w:t>
-      </w:r>
-      <w:r>
-        <w:rPr>
-          <w:sz w:val="28"/>
-        </w:rPr>
-        <w:t>a</w:t>
+        <w:t>Version  1.3a</w:t>
       </w:r>
     </w:p>
     <w:p>
@@ -965,15 +947,7 @@
       <w:bookmarkEnd w:id="1"/>
       <w:r>
         <w:rPr/>
-        <w:t xml:space="preserve">Operations, </w:t>
-      </w:r>
-      <w:r>
-        <w:rPr/>
-        <w:t>Accounting</w:t>
-      </w:r>
-      <w:r>
-        <w:rPr/>
-        <w:t xml:space="preserve"> and NEPA</w:t>
+        <w:t>Operations, Accounting and NEPA</w:t>
       </w:r>
     </w:p>
     <w:p>
@@ -985,11 +959,7 @@
       <w:bookmarkEnd w:id="2"/>
       <w:r>
         <w:rPr/>
-        <w:t>Colorado River System</w:t>
-      </w:r>
-      <w:r>
-        <w:rPr/>
-        <w:t xml:space="preserve"> Accounting</w:t>
+        <w:t>Colorado River System Accounting</w:t>
       </w:r>
     </w:p>
     <w:p>
@@ -1023,19 +993,7 @@
       </w:pPr>
       <w:r>
         <w:rPr/>
-        <w:t xml:space="preserve">With the possibility of future litigation and alteration of how the Compact is accounted this unfortunate black hole in system accounting needs to be remedied.  The Gila and its tributaries should have the same consumptive use, loss and natural </w:t>
-      </w:r>
-      <w:r>
-        <w:rPr/>
-        <w:t>flow</w:t>
-      </w:r>
-      <w:r>
-        <w:rPr/>
-        <w:t xml:space="preserve"> accounting as the rest of the system.  </w:t>
-      </w:r>
-      <w:r>
-        <w:rPr/>
-        <w:t>This data is essential for litigation, to understand the math, so must begin immediately</w:t>
+        <w:t>With the possibility of future litigation and alteration of how the Compact is accounted this unfortunate black hole in system accounting needs to be remedied.  The Gila and its tributaries should have the same consumptive use, loss and natural flow accounting as the rest of the system.  This data is essential for litigation, to understand the math, so must begin immediately</w:t>
       </w:r>
     </w:p>
     <w:p>
@@ -1067,93 +1025,17 @@
       </w:pPr>
       <w:r>
         <w:rPr/>
-        <w:t xml:space="preserve">At the end of this document is a table which is a first attempt to collect all of the essential data, in one </w:t>
-      </w:r>
-      <w:r>
-        <w:rPr/>
-        <w:t>place</w:t>
-      </w:r>
-      <w:r>
-        <w:rPr/>
-        <w:t>, necessary to understand the math, as far back as i</w:t>
-      </w:r>
-      <w:r>
-        <w:rPr/>
-        <w:t>s</w:t>
-      </w:r>
-      <w:r>
-        <w:rPr/>
-        <w:t xml:space="preserve"> available.  This a Foundational Principle. The table is not verified, it certainly may have bad data, don’t trust it, we just got the code necessary to generate it working.  Its a daunting task to verify it, make it easier to understand and finish.  I</w:t>
-      </w:r>
-      <w:r>
-        <w:rPr/>
-        <w:t>deally</w:t>
-      </w:r>
-      <w:r>
-        <w:rPr/>
-        <w:t xml:space="preserve"> USBR </w:t>
-      </w:r>
-      <w:r>
-        <w:rPr/>
-        <w:t xml:space="preserve">can </w:t>
-      </w:r>
-      <w:r>
-        <w:rPr/>
-        <w:t xml:space="preserve">take over this code and spreadsheet so there is a trusted standard where we can all go to get this data in an easily accessible </w:t>
-      </w:r>
-      <w:r>
-        <w:rPr/>
-        <w:t>wa</w:t>
-      </w:r>
-      <w:r>
-        <w:rPr/>
-        <w:t>y</w:t>
-      </w:r>
-      <w:r>
-        <w:rPr/>
-        <w:t xml:space="preserve"> without having to write all this code</w:t>
-      </w:r>
-      <w:r>
-        <w:rPr/>
-        <w:t>.  We all need to understand the math.</w:t>
-      </w:r>
-    </w:p>
-    <w:p>
-      <w:pPr>
-        <w:pStyle w:val="Normal"/>
-        <w:rPr/>
-      </w:pPr>
-      <w:r>
-        <w:rPr/>
-        <w:t xml:space="preserve">Finally, the Bureau needs to make all of its Lower Basin Annual Report data back to 1964 available in a similar accessible way, spreadsheets or CSV files.  We’ve made a first attempt at this.  Its pretty good but needs more verification and hasn’t been updated since 2022.  You need a special Python function to read these somewhat non standard CSV </w:t>
-      </w:r>
-      <w:r>
-        <w:rPr/>
-        <w:t xml:space="preserve">files, </w:t>
-      </w:r>
-      <w:r>
-        <w:rPr/>
-        <w:t>need to fix this</w:t>
-      </w:r>
-      <w:r>
-        <w:rPr/>
-        <w:t xml:space="preserve">.  It would be better if the USBR provide this data as a standard, trusted service, not necessarily in this format, </w:t>
-      </w:r>
-      <w:r>
-        <w:rPr/>
-        <w:t>maybe you already have it, couldn’t find it.</w:t>
-      </w:r>
-      <w:r>
-        <w:rPr/>
-        <w:t xml:space="preserve"> The code needs a lot of work to add </w:t>
-      </w:r>
-      <w:r>
-        <w:rPr/>
-        <w:t>UI</w:t>
-      </w:r>
-      <w:r>
-        <w:rPr/>
-        <w:t xml:space="preserve"> so you can easily visualize this data.  Volunteers are welcome.  I’ve been busy :)</w:t>
+        <w:t>At the end of this document is a table which is a first attempt to collect all of the essential data, in one place, necessary to understand the math, as far back as is available.  This a Foundational Principle. The table is not verified, it certainly may have bad data, don’t trust it, we just got the code necessary to generate it working.  Its a daunting task to verify it, make it easier to understand and finish.  Ideally USBR can take over this code and spreadsheet so there is a trusted standard where we can all go to get this data in an easily accessible way without having to write all this code.  We all need to understand the math.</w:t>
+      </w:r>
+    </w:p>
+    <w:p>
+      <w:pPr>
+        <w:pStyle w:val="Normal"/>
+        <w:rPr/>
+      </w:pPr>
+      <w:r>
+        <w:rPr/>
+        <w:t>Finally, the Bureau needs to make all of its Lower Basin Annual Report data back to 1964 available in a similar accessible way, spreadsheets or CSV files.  We’ve made a first attempt at this.  Its pretty good but needs more verification and hasn’t been updated since 2022.  You need a special Python function to read these somewhat non standard CSV files, need to fix this.  It would be better if the USBR provide this data as a standard, trusted service, not necessarily in this format, maybe you already have it, couldn’t find it. The code needs a lot of work to add UI so you can easily visualize this data.  Volunteers are welcome.  I’ve been busy :)</w:t>
       </w:r>
     </w:p>
     <w:p>
@@ -1628,19 +1510,7 @@
       <w:bookmarkEnd w:id="4"/>
       <w:r>
         <w:rPr/>
-        <w:t xml:space="preserve">Powell </w:t>
-      </w:r>
-      <w:r>
-        <w:rPr/>
-        <w:t xml:space="preserve">Infrastructure Protection </w:t>
-      </w:r>
-      <w:r>
-        <w:rPr/>
-        <w:t xml:space="preserve">&amp; </w:t>
-      </w:r>
-      <w:r>
-        <w:rPr/>
-        <w:t>Compact Compliance Pool</w:t>
+        <w:t>Powell Infrastructure Protection &amp; Compact Compliance Pool</w:t>
       </w:r>
     </w:p>
     <w:p>
@@ -1696,11 +1566,7 @@
       </w:pPr>
       <w:r>
         <w:rPr/>
-        <w:t xml:space="preserve">The Upper Basin has significant established water rights that must be used “exclusively” in the Upper Basin as defined in Article III(a).  These include Winters tribal water rights, in particular the two Ute Tribes in Colorado in Animas La Plata, and water rights for power plants that have been or will be retired.  </w:t>
-      </w:r>
-      <w:r>
-        <w:rPr/>
-        <w:t>This water is going to the Lower Basin for free which is inappropriate for an established Upper Basin water right,</w:t>
+        <w:t>The Upper Basin has significant established water rights that must be used “exclusively” in the Upper Basin as defined in Article III(a).  These include Winters tribal water rights, in particular the two Ute Tribes in Colorado in Animas La Plata, and water rights for power plants that have been or will be retired.  This water is going to the Lower Basin for free which is inappropriate for an established Upper Basin water right,</w:t>
       </w:r>
     </w:p>
     <w:p>
@@ -1714,59 +1580,7 @@
       </w:pPr>
       <w:r>
         <w:rPr/>
-        <w:t>I</w:t>
-      </w:r>
-      <w:r>
-        <w:rPr/>
-        <w:t>ts imperative the Upper Basin have more control over the timing of release</w:t>
-      </w:r>
-      <w:r>
-        <w:rPr/>
-        <w:t>s of water under established Upper Basin water rights</w:t>
-      </w:r>
-      <w:r>
-        <w:rPr/>
-        <w:t xml:space="preserve"> from Lake Powell to better balance infrastructure protection and compact compliance under Article III(d) and the 10 year 7.5 MAF moving average.  </w:t>
-      </w:r>
-      <w:r>
-        <w:rPr/>
-        <w:t>Examples of problematic Arizona behavior</w:t>
-      </w:r>
-      <w:r>
-        <w:rPr/>
-        <w:t xml:space="preserve"> </w:t>
-      </w:r>
-      <w:r>
-        <w:rPr/>
-        <w:t>in 2007 were lit</w:t>
-      </w:r>
-      <w:r>
-        <w:rPr/>
-        <w:t xml:space="preserve"> litigation threats </w:t>
-      </w:r>
-      <w:r>
-        <w:rPr/>
-        <w:t>to increase releases from Lake Powell to 9 MAF</w:t>
-      </w:r>
-      <w:r>
-        <w:rPr/>
-        <w:t>, and</w:t>
-      </w:r>
-      <w:r>
-        <w:rPr/>
-        <w:t xml:space="preserve"> documented manipulation of releases of Lake Powell by the Lower Basin </w:t>
-      </w:r>
-      <w:r>
-        <w:rPr/>
-        <w:t>under those terms</w:t>
-      </w:r>
-      <w:r>
-        <w:rPr/>
-        <w:t xml:space="preserve"> which are pushing the Upper Basin toward compact noncomplianc</w:t>
-      </w:r>
-      <w:r>
-        <w:rPr/>
-        <w:t xml:space="preserve">e right now contrary to Section 603 in the </w:t>
+        <w:t xml:space="preserve">Its imperative the Upper Basin have more control over the timing of releases of water under established Upper Basin water rights from Lake Powell to better balance infrastructure protection and compact compliance under Article III(d) and the 10 year 7.5 MAF moving average.  Examples of problematic Arizona behavior in 2007 were lit litigation threats to increase releases from Lake Powell to 9 MAF, and documented manipulation of releases of Lake Powell by the Lower Basin under those terms which are pushing the Upper Basin toward compact noncompliance right now contrary to Section 603 in the </w:t>
       </w:r>
       <w:hyperlink r:id="rId6">
         <w:r>
@@ -1822,15 +1636,7 @@
       </w:pPr>
       <w:r>
         <w:rPr/>
-        <w:t xml:space="preserve">We are concerned USBR might be using this process to make choices illustrated below  for the states they shouldn’t be making.  Please stick to LROC and the seven states </w:t>
-      </w:r>
-      <w:r>
-        <w:rPr/>
-        <w:t xml:space="preserve">have </w:t>
-      </w:r>
-      <w:r>
-        <w:rPr/>
-        <w:t>to get back to work under Article VI, non litigious cooperation.</w:t>
+        <w:t>We are concerned USBR might be using this process to make choices illustrated below  for the states they shouldn’t be making.  Please stick to LROC and the seven states have to get back to work under Article VI, non litigious cooperation.</w:t>
       </w:r>
     </w:p>
     <w:p>
@@ -1973,42 +1779,26 @@
       <w:bookmarkEnd w:id="5"/>
       <w:r>
         <w:rPr/>
-        <w:t xml:space="preserve">Litigation Issues Which Directly Impact </w:t>
-      </w:r>
-      <w:r>
-        <w:rPr/>
-        <w:t>Current O</w:t>
-      </w:r>
-      <w:r>
-        <w:rPr/>
-        <w:t>perations</w:t>
-      </w:r>
-    </w:p>
-    <w:p>
-      <w:pPr>
-        <w:pStyle w:val="Normal"/>
-        <w:rPr/>
-      </w:pPr>
-      <w:r>
-        <w:rPr/>
-      </w:r>
-    </w:p>
-    <w:p>
-      <w:pPr>
-        <w:pStyle w:val="Normal"/>
-        <w:rPr/>
-      </w:pPr>
-      <w:r>
-        <w:rPr/>
-        <w:t xml:space="preserve">These issues may be a matter of litigation but they in fact have to be resolved to have an even </w:t>
-      </w:r>
-      <w:r>
-        <w:rPr/>
-        <w:t xml:space="preserve">a </w:t>
-      </w:r>
-      <w:r>
-        <w:rPr/>
-        <w:t>minimally functional operating plan for this system.</w:t>
+        <w:t>Litigation Issues Which Directly Impact Current Operations</w:t>
+      </w:r>
+    </w:p>
+    <w:p>
+      <w:pPr>
+        <w:pStyle w:val="Normal"/>
+        <w:rPr/>
+      </w:pPr>
+      <w:r>
+        <w:rPr/>
+      </w:r>
+    </w:p>
+    <w:p>
+      <w:pPr>
+        <w:pStyle w:val="Normal"/>
+        <w:rPr/>
+      </w:pPr>
+      <w:r>
+        <w:rPr/>
+        <w:t>These issues may be a matter of litigation but they in fact have to be resolved to have an even a minimally functional operating plan for this system.</w:t>
       </w:r>
     </w:p>
     <w:p>
@@ -4650,15 +4440,7 @@
           <w:color w:val="000000"/>
           <w:shd w:fill="auto" w:val="clear"/>
         </w:rPr>
-        <w:t xml:space="preserve">The canonical Upper Basin position on the exclusion ("removal") of the Gila River from Colorado River Compact accounting, as affirmed in the 1963 Arizona v. California Supreme Court decision, is that the ruling's scope is limited to interpreting the Boulder Canyon Project Act (BCPA) and mainstream apportionments among Lower Basin states (Arizona: 2.8 MAF, California: 4.4 MAF, Nevada: 0.3 MAF from the 7.5 MAF mainstream allocation).   </w:t>
-      </w:r>
-      <w:r>
-        <w:rPr>
-          <w:rFonts w:ascii="Liberation Sans" w:hAnsi="Liberation Sans"/>
-          <w:color w:val="000000"/>
-          <w:shd w:fill="auto" w:val="clear"/>
-        </w:rPr>
-        <w:t>This is the Statutory construction case Mark Wilmer used to win Arizona v California.  Colorado and Wyoming were not party to this case, they refused California to join.  It was a Lower Basin case so it is doubtful it applies to them.</w:t>
+        <w:t>The canonical Upper Basin position on the exclusion ("removal") of the Gila River from Colorado River Compact accounting, as affirmed in the 1963 Arizona v. California Supreme Court decision, is that the ruling's scope is limited to interpreting the Boulder Canyon Project Act (BCPA) and mainstream apportionments among Lower Basin states (Arizona: 2.8 MAF, California: 4.4 MAF, Nevada: 0.3 MAF from the 7.5 MAF mainstream allocation).   This is the Statutory construction case Mark Wilmer used to win Arizona v California.  Colorado and Wyoming were not party to this case, they refused California to join.  It was a Lower Basin case so it is doubtful it applies to them.</w:t>
       </w:r>
     </w:p>
     <w:p>
@@ -5124,35 +4906,81 @@
           <w:color w:val="313131"/>
           <w:shd w:fill="auto" w:val="clear"/>
         </w:rPr>
-        <w:t xml:space="preserve">In spring 1905, an engineering mishap led to a major breach of the River's bank that wasn’t closed until February 1907.  The breach filled the </w:t>
-      </w:r>
+        <w:t>In spring 1905, an engineering mishap led to a major breach of the River's bank that wasn’t closed until February 1907.  The breach filled the Salton Sea with 15 MAF of water.</w:t>
+      </w:r>
+    </w:p>
+    <w:p>
+      <w:pPr>
+        <w:pStyle w:val="TextBody"/>
+        <w:spacing w:before="0" w:after="0"/>
+        <w:rPr>
+          <w:rFonts w:ascii="Liberation Sans" w:hAnsi="Liberation Sans"/>
+        </w:rPr>
+      </w:pPr>
+      <w:r>
+        <w:rPr>
+          <w:rFonts w:ascii="Liberation Sans" w:hAnsi="Liberation Sans"/>
+        </w:rPr>
+      </w:r>
+    </w:p>
+    <w:p>
+      <w:pPr>
+        <w:pStyle w:val="Normal"/>
+        <w:spacing w:before="0" w:after="0"/>
+        <w:rPr>
+          <w:rFonts w:ascii="Liberation Sans" w:hAnsi="Liberation Sans"/>
+        </w:rPr>
+      </w:pPr>
       <w:r>
         <w:rPr>
           <w:rFonts w:ascii="Liberation Sans" w:hAnsi="Liberation Sans"/>
           <w:color w:val="313131"/>
-          <w:shd w:fill="auto" w:val="clear"/>
-        </w:rPr>
-        <w:t>Salton Sea</w:t>
-      </w:r>
+        </w:rPr>
+        <w:t>The Sea is now evaporating 1.3 MAF of Colorado River water a year. That’s as much as Lake Mead and Lake Powell combined, this is not sustainable with today’s Colorado River.  It’s math.</w:t>
+      </w:r>
+    </w:p>
+    <w:p>
+      <w:pPr>
+        <w:pStyle w:val="Normal"/>
+        <w:spacing w:before="0" w:after="0"/>
+        <w:rPr>
+          <w:rFonts w:ascii="Liberation Sans" w:hAnsi="Liberation Sans"/>
+        </w:rPr>
+      </w:pPr>
+      <w:r>
+        <w:rPr>
+          <w:rFonts w:ascii="Liberation Sans" w:hAnsi="Liberation Sans"/>
+        </w:rPr>
+      </w:r>
+    </w:p>
+    <w:p>
+      <w:pPr>
+        <w:pStyle w:val="TextBody"/>
+        <w:spacing w:before="0" w:after="0"/>
+        <w:rPr>
+          <w:rFonts w:ascii="Liberation Sans" w:hAnsi="Liberation Sans"/>
+        </w:rPr>
+      </w:pPr>
       <w:r>
         <w:rPr>
           <w:rFonts w:ascii="Liberation Sans" w:hAnsi="Liberation Sans"/>
           <w:color w:val="313131"/>
-          <w:shd w:fill="auto" w:val="clear"/>
-        </w:rPr>
-        <w:t xml:space="preserve"> with 15 MAF of water.</w:t>
-      </w:r>
-    </w:p>
-    <w:p>
-      <w:pPr>
-        <w:pStyle w:val="TextBody"/>
+        </w:rPr>
+        <w:t>Waste water, mostly from Imperial Irrigation District and Coachella sustained the sea until the 2003 Quantitative Settlement Agreement(QSA) in the wake of the 2002 drought. This forced California back under its 1929 4.4 MAF limitation on Colorado River Water Use,. Before then it had been regularly diverting 5+ MAF under Article III(b) surplus water, an IV in the arm of a sick ecosystem,. The QSA pushed Imperial waste water going into the Sea below break even. This got worse with the 2018 DCP and Demand Management.  Now about 1 MAF of waste water from IID, Coachella and Mexico enter the sea each year so there is a 300,000 AF deficit every year.  It is shrinking and as it shrinks salinity increases.</w:t>
+      </w:r>
+    </w:p>
+    <w:p>
+      <w:pPr>
+        <w:pStyle w:val="Normal"/>
         <w:spacing w:before="0" w:after="0"/>
         <w:rPr>
           <w:rFonts w:ascii="Liberation Sans" w:hAnsi="Liberation Sans"/>
         </w:rPr>
       </w:pPr>
       <w:r>
-        <w:rPr/>
+        <w:rPr>
+          <w:rFonts w:ascii="Liberation Sans" w:hAnsi="Liberation Sans"/>
+        </w:rPr>
       </w:r>
     </w:p>
     <w:p>
@@ -5168,202 +4996,37 @@
           <w:rFonts w:ascii="Liberation Sans" w:hAnsi="Liberation Sans"/>
           <w:color w:val="313131"/>
         </w:rPr>
-        <w:t xml:space="preserve">The Sea is now evaporating 1.3 MAF of Colorado River water a year. That’s as much as Lake Mead and Lake Powell combined, this is not sustainable with today’s Colorado River.  </w:t>
-      </w:r>
+        <w:t>Irrigation waste water may put 5 unit trains of salt into the sea each week.  The sea has no outlet so it will never leave.</w:t>
+      </w:r>
+    </w:p>
+    <w:p>
+      <w:pPr>
+        <w:pStyle w:val="Normal"/>
+        <w:spacing w:before="0" w:after="0"/>
+        <w:rPr>
+          <w:rFonts w:ascii="Liberation Sans" w:hAnsi="Liberation Sans"/>
+        </w:rPr>
+      </w:pPr>
+      <w:r>
+        <w:rPr>
+          <w:rFonts w:ascii="Liberation Sans" w:hAnsi="Liberation Sans"/>
+        </w:rPr>
+      </w:r>
+    </w:p>
+    <w:p>
+      <w:pPr>
+        <w:pStyle w:val="Normal"/>
+        <w:spacing w:before="0" w:after="0"/>
+        <w:rPr>
+          <w:rFonts w:ascii="Liberation Sans" w:hAnsi="Liberation Sans"/>
+        </w:rPr>
+      </w:pPr>
       <w:r>
         <w:rPr>
           <w:rFonts w:ascii="Liberation Sans" w:hAnsi="Liberation Sans"/>
           <w:color w:val="313131"/>
         </w:rPr>
-        <w:t>It’s math.</w:t>
-      </w:r>
-    </w:p>
-    <w:p>
-      <w:pPr>
-        <w:pStyle w:val="Normal"/>
-        <w:spacing w:before="0" w:after="0"/>
-        <w:rPr>
-          <w:rFonts w:ascii="Liberation Sans" w:hAnsi="Liberation Sans"/>
-        </w:rPr>
-      </w:pPr>
-      <w:r>
-        <w:rPr>
-          <w:rFonts w:ascii="Liberation Sans" w:hAnsi="Liberation Sans"/>
-        </w:rPr>
-      </w:r>
-    </w:p>
-    <w:p>
-      <w:pPr>
-        <w:pStyle w:val="TextBody"/>
-        <w:spacing w:before="0" w:after="0"/>
-        <w:rPr>
-          <w:rFonts w:ascii="Liberation Sans" w:hAnsi="Liberation Sans"/>
-        </w:rPr>
-      </w:pPr>
-      <w:r>
-        <w:rPr>
-          <w:rFonts w:ascii="Liberation Sans" w:hAnsi="Liberation Sans"/>
-          <w:color w:val="313131"/>
-        </w:rPr>
-        <w:t xml:space="preserve">Waste water, mostly from Imperial Irrigation District and Coachella sustained the sea until the 2003 Quantitative Settlement Agreement(QSA) in the wake of the 2002 drought. </w:t>
-      </w:r>
-      <w:r>
-        <w:rPr>
-          <w:rFonts w:ascii="Liberation Sans" w:hAnsi="Liberation Sans"/>
-          <w:color w:val="313131"/>
-        </w:rPr>
-        <w:t>This</w:t>
-      </w:r>
-      <w:r>
-        <w:rPr>
-          <w:rFonts w:ascii="Liberation Sans" w:hAnsi="Liberation Sans"/>
-          <w:color w:val="313131"/>
-        </w:rPr>
-        <w:t xml:space="preserve"> forced California back under its 1929 4.4 MAF limitation on Colorado River Water Use,. Before then it had been regularly diverting 5</w:t>
-      </w:r>
-      <w:r>
-        <w:rPr>
-          <w:rFonts w:ascii="Liberation Sans" w:hAnsi="Liberation Sans"/>
-          <w:color w:val="313131"/>
-        </w:rPr>
-        <w:t>+</w:t>
-      </w:r>
-      <w:r>
-        <w:rPr>
-          <w:rFonts w:ascii="Liberation Sans" w:hAnsi="Liberation Sans"/>
-          <w:color w:val="313131"/>
-        </w:rPr>
-        <w:t xml:space="preserve"> MAF under Article III(b) surplus water, </w:t>
-      </w:r>
-      <w:r>
-        <w:rPr>
-          <w:rFonts w:ascii="Liberation Sans" w:hAnsi="Liberation Sans"/>
-          <w:color w:val="313131"/>
-        </w:rPr>
-        <w:t>an IV in the arm of a sick ecosystem,.</w:t>
-      </w:r>
-      <w:r>
-        <w:rPr>
-          <w:rFonts w:ascii="Liberation Sans" w:hAnsi="Liberation Sans"/>
-          <w:color w:val="313131"/>
-        </w:rPr>
-        <w:t xml:space="preserve"> The QSA pushed Imperial waste water going into the Sea below break even. </w:t>
-      </w:r>
-      <w:r>
-        <w:rPr>
-          <w:rFonts w:ascii="Liberation Sans" w:hAnsi="Liberation Sans"/>
-          <w:color w:val="313131"/>
-        </w:rPr>
-        <w:t xml:space="preserve">This got worse with the 2018 DCP and Demand Management.  </w:t>
-      </w:r>
-      <w:r>
-        <w:rPr>
-          <w:rFonts w:ascii="Liberation Sans" w:hAnsi="Liberation Sans"/>
-          <w:color w:val="313131"/>
-        </w:rPr>
-        <w:t>Now about</w:t>
-      </w:r>
-      <w:r>
-        <w:rPr>
-          <w:rFonts w:ascii="Liberation Sans" w:hAnsi="Liberation Sans"/>
-          <w:color w:val="313131"/>
-        </w:rPr>
-        <w:t xml:space="preserve"> 1 MAF of waste water from IID, Coachella and Mexico enter the sea each year so there is a 300,000 AF deficit every year.  It is shrinking and as it shrinks salinity increases.</w:t>
-      </w:r>
-    </w:p>
-    <w:p>
-      <w:pPr>
-        <w:pStyle w:val="Normal"/>
-        <w:spacing w:before="0" w:after="0"/>
-        <w:rPr>
-          <w:rFonts w:ascii="Liberation Sans" w:hAnsi="Liberation Sans"/>
-        </w:rPr>
-      </w:pPr>
-      <w:r>
-        <w:rPr>
-          <w:rFonts w:ascii="Liberation Sans" w:hAnsi="Liberation Sans"/>
-        </w:rPr>
-      </w:r>
-    </w:p>
-    <w:p>
-      <w:pPr>
-        <w:pStyle w:val="Normal"/>
-        <w:spacing w:before="0" w:after="0"/>
-        <w:rPr>
-          <w:rFonts w:ascii="Liberation Sans" w:hAnsi="Liberation Sans"/>
-        </w:rPr>
-      </w:pPr>
-      <w:r>
-        <w:rPr>
-          <w:rFonts w:ascii="Liberation Sans" w:hAnsi="Liberation Sans"/>
-          <w:color w:val="313131"/>
-        </w:rPr>
-        <w:t>Irrigation waste water may put 5 unit trains of salt into the sea each week.  The sea has no outlet so it will never leave.</w:t>
-      </w:r>
-    </w:p>
-    <w:p>
-      <w:pPr>
-        <w:pStyle w:val="Normal"/>
-        <w:spacing w:before="0" w:after="0"/>
-        <w:rPr>
-          <w:rFonts w:ascii="Liberation Sans" w:hAnsi="Liberation Sans"/>
-        </w:rPr>
-      </w:pPr>
-      <w:r>
-        <w:rPr>
-          <w:rFonts w:ascii="Liberation Sans" w:hAnsi="Liberation Sans"/>
-        </w:rPr>
-      </w:r>
-    </w:p>
-    <w:p>
-      <w:pPr>
-        <w:pStyle w:val="Normal"/>
-        <w:spacing w:before="0" w:after="0"/>
-        <w:rPr>
-          <w:rFonts w:ascii="Liberation Sans" w:hAnsi="Liberation Sans"/>
-        </w:rPr>
-      </w:pPr>
-      <w:r>
-        <w:rPr>
-          <w:rFonts w:ascii="Liberation Sans" w:hAnsi="Liberation Sans"/>
-          <w:color w:val="313131"/>
-        </w:rPr>
-        <w:t xml:space="preserve">The Sea is a dead man walking.  It will inevitably go hyper saline and die </w:t>
-      </w:r>
-      <w:r>
-        <w:rPr>
-          <w:rFonts w:ascii="Liberation Sans" w:hAnsi="Liberation Sans"/>
-          <w:color w:val="313131"/>
-        </w:rPr>
-        <w:t>on the current trajectory</w:t>
-      </w:r>
-      <w:r>
-        <w:rPr>
-          <w:rFonts w:ascii="Liberation Sans" w:hAnsi="Liberation Sans"/>
-          <w:color w:val="313131"/>
-        </w:rPr>
-        <w:t xml:space="preserve">.  </w:t>
-      </w:r>
-      <w:r>
-        <w:rPr>
-          <w:rFonts w:ascii="Liberation Sans" w:hAnsi="Liberation Sans"/>
-          <w:color w:val="313131"/>
-        </w:rPr>
-        <w:t xml:space="preserve">Jenny Ross is a top scientist on the </w:t>
-      </w:r>
-      <w:r>
-        <w:rPr>
-          <w:rFonts w:ascii="Liberation Sans" w:hAnsi="Liberation Sans"/>
-          <w:color w:val="313131"/>
-        </w:rPr>
-        <w:t>S</w:t>
-      </w:r>
-      <w:r>
-        <w:rPr>
-          <w:rFonts w:ascii="Liberation Sans" w:hAnsi="Liberation Sans"/>
-          <w:color w:val="313131"/>
-        </w:rPr>
-        <w:t xml:space="preserve">ea.  These are her </w:t>
+        <w:t xml:space="preserve">The Sea is a dead man walking.  It will inevitably go hyper saline and die on the current trajectory.  Jenny Ross is a top scientist on the Sea.  These are her </w:t>
       </w:r>
       <w:hyperlink r:id="rId16">
         <w:r>
@@ -5380,49 +5043,37 @@
           <w:rFonts w:ascii="Liberation Sans" w:hAnsi="Liberation Sans"/>
           <w:color w:val="313131"/>
         </w:rPr>
-        <w:t xml:space="preserve"> in first round.  She affirms the Sea is dying and wants to save it</w:t>
-      </w:r>
+        <w:t xml:space="preserve"> in first round.  She affirms the Sea is dying and wants to save it, we wish here well.</w:t>
+      </w:r>
+    </w:p>
+    <w:p>
+      <w:pPr>
+        <w:pStyle w:val="Normal"/>
+        <w:spacing w:before="0" w:after="0"/>
+        <w:rPr>
+          <w:rFonts w:ascii="Liberation Sans" w:hAnsi="Liberation Sans"/>
+        </w:rPr>
+      </w:pPr>
+      <w:r>
+        <w:rPr>
+          <w:rFonts w:ascii="Liberation Sans" w:hAnsi="Liberation Sans"/>
+        </w:rPr>
+      </w:r>
+    </w:p>
+    <w:p>
+      <w:pPr>
+        <w:pStyle w:val="Normal"/>
+        <w:spacing w:before="0" w:after="0"/>
+        <w:rPr>
+          <w:rFonts w:ascii="Liberation Sans" w:hAnsi="Liberation Sans"/>
+        </w:rPr>
+      </w:pPr>
       <w:r>
         <w:rPr>
           <w:rFonts w:ascii="Liberation Sans" w:hAnsi="Liberation Sans"/>
           <w:color w:val="313131"/>
         </w:rPr>
-        <w:t>, we wish here well.</w:t>
-      </w:r>
-    </w:p>
-    <w:p>
-      <w:pPr>
-        <w:pStyle w:val="Normal"/>
-        <w:spacing w:before="0" w:after="0"/>
-        <w:rPr>
-          <w:rFonts w:ascii="Liberation Sans" w:hAnsi="Liberation Sans"/>
-        </w:rPr>
-      </w:pPr>
-      <w:r>
-        <w:rPr/>
-      </w:r>
-    </w:p>
-    <w:p>
-      <w:pPr>
-        <w:pStyle w:val="Normal"/>
-        <w:spacing w:before="0" w:after="0"/>
-        <w:rPr>
-          <w:rFonts w:ascii="Liberation Sans" w:hAnsi="Liberation Sans"/>
-        </w:rPr>
-      </w:pPr>
-      <w:r>
-        <w:rPr>
-          <w:rFonts w:ascii="Liberation Sans" w:hAnsi="Liberation Sans"/>
-          <w:color w:val="313131"/>
-        </w:rPr>
-        <w:t>Bur, we all</w:t>
-      </w:r>
-      <w:r>
-        <w:rPr>
-          <w:rFonts w:ascii="Liberation Sans" w:hAnsi="Liberation Sans"/>
-          <w:color w:val="313131"/>
-        </w:rPr>
-        <w:t xml:space="preserve"> face a difficult choice that must be made immediately:</w:t>
+        <w:t>Bur, we all face a difficult choice that must be made immediately:</w:t>
       </w:r>
     </w:p>
     <w:p>
@@ -5451,31 +5102,7 @@
       </w:pPr>
       <w:r>
         <w:rPr/>
-        <w:t xml:space="preserve">California and the U.S. must embark on a very expensive and extremely difficult project to save the Sea </w:t>
-      </w:r>
-      <w:r>
-        <w:rPr/>
-        <w:t>in an artificial way</w:t>
-      </w:r>
-      <w:r>
-        <w:rPr/>
-        <w:t xml:space="preserve"> by importing ocean water into the sea, most probably with </w:t>
-      </w:r>
-      <w:r>
-        <w:rPr/>
-        <w:t>additional</w:t>
-      </w:r>
-      <w:r>
-        <w:rPr/>
-        <w:t xml:space="preserve"> expensive measures to balance salinity.  A Sea to Sea pipeline from the Gulf of California is the leading but not only possibility. This must be done quickly and affordably which is a near impossibility </w:t>
-      </w:r>
-      <w:r>
-        <w:rPr/>
-        <w:t>with</w:t>
-      </w:r>
-      <w:r>
-        <w:rPr/>
-        <w:t xml:space="preserve"> Mexico and California.</w:t>
+        <w:t>California and the U.S. must embark on a very expensive and extremely difficult project to save the Sea in an artificial way by importing ocean water into the sea, most probably with additional expensive measures to balance salinity.  A Sea to Sea pipeline from the Gulf of California is the leading but not only possibility. This must be done quickly and affordably which is a near impossibility with Mexico and California.</w:t>
       </w:r>
     </w:p>
     <w:p>
@@ -5505,23 +5132,7 @@
       </w:pPr>
       <w:r>
         <w:rPr/>
-        <w:t xml:space="preserve">We must let the Sea follow its natural cycle and </w:t>
-      </w:r>
-      <w:r>
-        <w:rPr/>
-        <w:t>die</w:t>
-      </w:r>
-      <w:r>
-        <w:rPr/>
-        <w:t xml:space="preserve">.  The sea needs to return to either a dry lake bed or a much smaller sea where inflows and evaporation are in balance.  Salinity would still be a continuing problem in the latter.  Dust will be a major problem and must be mitigated. A dry lake bed is natural so it must be possible, </w:t>
-      </w:r>
-      <w:r>
-        <w:rPr/>
-        <w:t xml:space="preserve">but </w:t>
-      </w:r>
-      <w:r>
-        <w:rPr/>
-        <w:t>out of scope here. If Jenny and others can design a smaller, sustainable ecosystem, a new Garden of Eden, that would be ideal under Foundational Principles.</w:t>
+        <w:t>We must let the Sea follow its natural cycle and die.  The sea needs to return to either a dry lake bed or a much smaller sea where inflows and evaporation are in balance.  Salinity would still be a continuing problem in the latter.  Dust will be a major problem and must be mitigated. A dry lake bed is natural so it must be possible, but out of scope here. If Jenny and others can design a smaller, sustainable ecosystem, a new Garden of Eden, that would be ideal under Foundational Principles.</w:t>
       </w:r>
     </w:p>
     <w:p>
@@ -5551,121 +5162,37 @@
           <w:rFonts w:ascii="Liberation Sans" w:hAnsi="Liberation Sans"/>
           <w:color w:val="313131"/>
         </w:rPr>
-        <w:t xml:space="preserve">It is not our place to influence this choice.  But... to bring the River back into balance the math has to work, </w:t>
-      </w:r>
+        <w:t xml:space="preserve">It is not our place to influence this choice.  But... to bring the River back into balance the math has to work, a Foundational Pricipal.  To make the math work the River can no longer waste water into the Sea.  There is an old saying, “You rob banks because that’s where the money is”.  In this case we look to Imperial Valley only because that is where the water is.  In much of the rest of the basin, not all, return flows return to the River for reuse.  In Imperial 1 MAF of return flows are being lost because it is a trans basin diversion.  </w:t>
+      </w:r>
+    </w:p>
+    <w:p>
+      <w:pPr>
+        <w:pStyle w:val="Normal"/>
+        <w:spacing w:before="0" w:after="0"/>
+        <w:rPr>
+          <w:rFonts w:ascii="Liberation Sans" w:hAnsi="Liberation Sans"/>
+        </w:rPr>
+      </w:pPr>
+      <w:r>
+        <w:rPr>
+          <w:rFonts w:ascii="Liberation Sans" w:hAnsi="Liberation Sans"/>
+        </w:rPr>
+      </w:r>
+    </w:p>
+    <w:p>
+      <w:pPr>
+        <w:pStyle w:val="Normal"/>
+        <w:spacing w:before="0" w:after="0"/>
+        <w:rPr>
+          <w:rFonts w:ascii="Liberation Sans" w:hAnsi="Liberation Sans"/>
+        </w:rPr>
+      </w:pPr>
       <w:r>
         <w:rPr>
           <w:rFonts w:ascii="Liberation Sans" w:hAnsi="Liberation Sans"/>
           <w:color w:val="313131"/>
         </w:rPr>
-        <w:t xml:space="preserve">a Foundational Pricipal. </w:t>
-      </w:r>
-      <w:r>
-        <w:rPr>
-          <w:rFonts w:ascii="Liberation Sans" w:hAnsi="Liberation Sans"/>
-          <w:color w:val="313131"/>
-        </w:rPr>
-        <w:t xml:space="preserve"> </w:t>
-      </w:r>
-      <w:r>
-        <w:rPr>
-          <w:rFonts w:ascii="Liberation Sans" w:hAnsi="Liberation Sans"/>
-          <w:color w:val="313131"/>
-        </w:rPr>
-        <w:t>T</w:t>
-      </w:r>
-      <w:r>
-        <w:rPr>
-          <w:rFonts w:ascii="Liberation Sans" w:hAnsi="Liberation Sans"/>
-          <w:color w:val="313131"/>
-        </w:rPr>
-        <w:t xml:space="preserve">o make the math work the River can no longer waste water into the Sea.  There is an old saying, “You rob banks because that’s where the money is”.  In this case we look to Imperial Valley only because that is where the water is.  In </w:t>
-      </w:r>
-      <w:r>
-        <w:rPr>
-          <w:rFonts w:ascii="Liberation Sans" w:hAnsi="Liberation Sans"/>
-          <w:color w:val="313131"/>
-        </w:rPr>
-        <w:t>much of the</w:t>
-      </w:r>
-      <w:r>
-        <w:rPr>
-          <w:rFonts w:ascii="Liberation Sans" w:hAnsi="Liberation Sans"/>
-          <w:color w:val="313131"/>
-        </w:rPr>
-        <w:t xml:space="preserve"> rest of the basin, </w:t>
-      </w:r>
-      <w:r>
-        <w:rPr>
-          <w:rFonts w:ascii="Liberation Sans" w:hAnsi="Liberation Sans"/>
-          <w:color w:val="313131"/>
-        </w:rPr>
-        <w:t>not all,</w:t>
-      </w:r>
-      <w:r>
-        <w:rPr>
-          <w:rFonts w:ascii="Liberation Sans" w:hAnsi="Liberation Sans"/>
-          <w:color w:val="313131"/>
-        </w:rPr>
-        <w:t xml:space="preserve"> return flows return to the River for reuse.  In Imperial 1 MAF of return flows are being lost because it is a trans basin diversion.  </w:t>
-      </w:r>
-    </w:p>
-    <w:p>
-      <w:pPr>
-        <w:pStyle w:val="Normal"/>
-        <w:spacing w:before="0" w:after="0"/>
-        <w:rPr>
-          <w:rFonts w:ascii="Liberation Sans" w:hAnsi="Liberation Sans"/>
-        </w:rPr>
-      </w:pPr>
-      <w:r>
-        <w:rPr>
-          <w:rFonts w:ascii="Liberation Sans" w:hAnsi="Liberation Sans"/>
-        </w:rPr>
-      </w:r>
-    </w:p>
-    <w:p>
-      <w:pPr>
-        <w:pStyle w:val="Normal"/>
-        <w:spacing w:before="0" w:after="0"/>
-        <w:rPr>
-          <w:rFonts w:ascii="Liberation Sans" w:hAnsi="Liberation Sans"/>
-        </w:rPr>
-      </w:pPr>
-      <w:r>
-        <w:rPr>
-          <w:rFonts w:ascii="Liberation Sans" w:hAnsi="Liberation Sans"/>
-          <w:color w:val="313131"/>
-        </w:rPr>
-        <w:t xml:space="preserve">We do not want to “rob” this bank.  Imperial agriculture is a precious national resource.  We not only want to preserve it but make it better, its a </w:t>
-      </w:r>
-      <w:r>
-        <w:rPr>
-          <w:rFonts w:ascii="Liberation Sans" w:hAnsi="Liberation Sans"/>
-          <w:color w:val="313131"/>
-        </w:rPr>
-        <w:t>F</w:t>
-      </w:r>
-      <w:r>
-        <w:rPr>
-          <w:rFonts w:ascii="Liberation Sans" w:hAnsi="Liberation Sans"/>
-          <w:color w:val="313131"/>
-        </w:rPr>
-        <w:t xml:space="preserve">oundational </w:t>
-      </w:r>
-      <w:r>
-        <w:rPr>
-          <w:rFonts w:ascii="Liberation Sans" w:hAnsi="Liberation Sans"/>
-          <w:color w:val="313131"/>
-        </w:rPr>
-        <w:t>P</w:t>
-      </w:r>
-      <w:r>
-        <w:rPr>
-          <w:rFonts w:ascii="Liberation Sans" w:hAnsi="Liberation Sans"/>
-          <w:color w:val="313131"/>
-        </w:rPr>
-        <w:t>rincipal.</w:t>
+        <w:t>We do not want to “rob” this bank.  Imperial agriculture is a precious national resource.  We not only want to preserve it but make it better, its a Foundational Principal.</w:t>
       </w:r>
     </w:p>
     <w:p>
@@ -5760,11 +5287,7 @@
       </w:pPr>
       <w:r>
         <w:rPr/>
-        <w:t>These are some ways</w:t>
-      </w:r>
-      <w:r>
-        <w:rPr/>
-        <w:t xml:space="preserve"> to recover this tile water through improved farming practices which have been done in Mexico and Yuma:</w:t>
+        <w:t>These are some ways to recover this tile water through improved farming practices which have been done in Mexico and Yuma:</w:t>
       </w:r>
     </w:p>
     <w:p>
@@ -5809,15 +5332,7 @@
       </w:pPr>
       <w:r>
         <w:rPr/>
-        <w:t xml:space="preserve">Pressure requires pumps with an extensive electrical system, or piping water if there is sufficient drop.  Pumps are </w:t>
-      </w:r>
-      <w:r>
-        <w:rPr/>
-        <w:t xml:space="preserve">a </w:t>
-      </w:r>
-      <w:r>
-        <w:rPr/>
-        <w:t>continuing expense, pressurized pipe are a big up front expense</w:t>
+        <w:t>Pressure requires pumps with an extensive electrical system, or piping water if there is sufficient drop.  Pumps are a continuing expense, pressurized pipe are a big up front expense</w:t>
       </w:r>
     </w:p>
     <w:p>
@@ -5895,11 +5410,7 @@
       </w:pPr>
       <w:r>
         <w:rPr/>
-        <w:t xml:space="preserve">Environmentalists will obviously and rightly be devastated be the loss of habitat from letting the Sea die.  It is a foundational principal to preserve </w:t>
-      </w:r>
-      <w:r>
-        <w:rPr/>
-        <w:t>viable ecosystems but not use NEPA to save marginal or dying ones.</w:t>
+        <w:t>Environmentalists will obviously and rightly be devastated be the loss of habitat from letting the Sea die.  It is a foundational principal to preserve viable ecosystems but not use NEPA to save marginal or dying ones.</w:t>
       </w:r>
     </w:p>
     <w:p>
@@ -5929,43 +5440,7 @@
           <w:bCs/>
           <w:color w:val="313131"/>
         </w:rPr>
-        <w:t xml:space="preserve">We could redirect 100,000 AF of the saved water to the now dry Colorado River Delta, it would bloom like Cienega is blooming, home for birds </w:t>
-      </w:r>
-      <w:r>
-        <w:rPr>
-          <w:rFonts w:ascii="Liberation Sans" w:hAnsi="Liberation Sans"/>
-          <w:b/>
-          <w:bCs/>
-          <w:color w:val="313131"/>
-        </w:rPr>
-        <w:t xml:space="preserve">and fish. It is a worthy goal to finally </w:t>
-      </w:r>
-      <w:r>
-        <w:rPr>
-          <w:rFonts w:ascii="Liberation Sans" w:hAnsi="Liberation Sans"/>
-          <w:b/>
-          <w:bCs/>
-          <w:color w:val="313131"/>
-        </w:rPr>
-        <w:t xml:space="preserve">fix the </w:t>
-      </w:r>
-      <w:r>
-        <w:rPr>
-          <w:rFonts w:ascii="Liberation Sans" w:hAnsi="Liberation Sans"/>
-          <w:b/>
-          <w:bCs/>
-          <w:color w:val="313131"/>
-        </w:rPr>
-        <w:t>righteous</w:t>
-      </w:r>
-      <w:r>
-        <w:rPr>
-          <w:rFonts w:ascii="Liberation Sans" w:hAnsi="Liberation Sans"/>
-          <w:b/>
-          <w:bCs/>
-          <w:color w:val="313131"/>
-        </w:rPr>
-        <w:t xml:space="preserve"> demands for more water from Audubon. Abandon a doomed ecosystem and save a viable one.  </w:t>
+        <w:t xml:space="preserve">We could redirect 100,000 AF of the saved water to the now dry Colorado River Delta, it would bloom like Cienega is blooming, home for birds and fish. It is a worthy goal to finally fix the righteous demands for more water from Audubon. Abandon a doomed ecosystem and save a viable one.  </w:t>
       </w:r>
     </w:p>
     <w:p>
@@ -5981,7 +5456,12 @@
         </w:rPr>
       </w:pPr>
       <w:r>
-        <w:rPr/>
+        <w:rPr>
+          <w:rFonts w:ascii="Liberation Sans" w:hAnsi="Liberation Sans"/>
+          <w:b/>
+          <w:bCs/>
+          <w:color w:val="313131"/>
+        </w:rPr>
       </w:r>
     </w:p>
     <w:p>
@@ -6009,7 +5489,9 @@
         </w:rPr>
       </w:pPr>
       <w:r>
-        <w:rPr/>
+        <w:rPr>
+          <w:rFonts w:ascii="Liberation Sans" w:hAnsi="Liberation Sans"/>
+        </w:rPr>
       </w:r>
     </w:p>
     <w:p>
@@ -6023,14 +5505,7 @@
           <w:b w:val="false"/>
           <w:bCs w:val="false"/>
         </w:rPr>
-        <w:t xml:space="preserve">This would require at least 80 miles of HDPE pipe and a 200’ lift of the water so substantial pumps and electricity.  IID generates a lot of power so would be ideal for this.  </w:t>
-      </w:r>
-      <w:r>
-        <w:rPr>
-          <w:b w:val="false"/>
-          <w:bCs w:val="false"/>
-        </w:rPr>
-        <w:t>Funding pumping costs is key</w:t>
+        <w:t>This would require at least 80 miles of HDPE pipe and a 200’ lift of the water so substantial pumps and electricity.  IID generates a lot of power so would be ideal for this.  Funding pumping costs is key</w:t>
       </w:r>
       <w:r>
         <w:br w:type="page"/>
@@ -6104,7 +5579,17 @@
       </w:pPr>
       <w:r>
         <w:rPr/>
-        <w:object w:dxaOrig="17501" w:dyaOrig="18795">
+      </w:r>
+    </w:p>
+    <w:p>
+      <w:pPr>
+        <w:pStyle w:val="Normal"/>
+        <w:spacing w:before="0" w:after="200"/>
+        <w:rPr/>
+      </w:pPr>
+      <w:r>
+        <w:rPr/>
+        <w:object w:dxaOrig="18201" w:dyaOrig="19396">
           <v:shapetype id="_x0000_tole_rId17" coordsize="21600,21600" o:spt="ole_rId17" o:preferrelative="t" path="m@4@5l@4@11@9@11@9@5xe" filled="f" stroked="f">
             <v:stroke joinstyle="miter"/>
             <v:formulas>
@@ -6124,11 +5609,11 @@
             <v:path o:extrusionok="f" gradientshapeok="t" o:connecttype="rect"/>
             <o:lock v:ext="edit" aspectratio="t"/>
           </v:shapetype>
-          <v:shape id="ole_rId17" type="_x0000_tole_rId17" style="position:absolute;margin-left:-72pt;margin-top:0pt;width:612pt;height:657.25pt;mso-position-horizontal-relative:text;mso-position-vertical-relative:text" filled="f" o:ole="">
+          <v:shape id="ole_rId17" type="_x0000_tole_rId17" style="position:absolute;margin-left:-72pt;margin-top:0pt;width:612pt;height:652.15pt;mso-position-horizontal-relative:text;mso-position-vertical-relative:text" filled="f" o:ole="">
             <v:imagedata r:id="rId18" o:title=""/>
             <w10:wrap type="square" side="largest"/>
           </v:shape>
-          <o:OLEObject Type="Embed" ProgID="Excel.Sheet.12" ShapeID="ole_rId17" DrawAspect="Content" ObjectID="_499990132" r:id="rId17"/>
+          <o:OLEObject Type="Embed" ProgID="Excel.Sheet.12" ShapeID="ole_rId17" DrawAspect="Content" ObjectID="_1571210021" r:id="rId17"/>
         </w:object>
       </w:r>
     </w:p>

</xml_diff>

<commit_message>
Clean out cruft not related to Colorado River
</commit_message>
<xml_diff>
--- a/doc/Colorado_River_EIS_Millard_Suckla.docx
+++ b/doc/Colorado_River_EIS_Millard_Suckla.docx
@@ -93,7 +93,7 @@
         <w:rPr>
           <w:sz w:val="28"/>
         </w:rPr>
-        <w:t>Date: Mar 2, 2026</w:t>
+        <w:t>Date: March 4, 2026</w:t>
       </w:r>
     </w:p>
     <w:p>
@@ -106,7 +106,7 @@
         <w:rPr>
           <w:sz w:val="28"/>
         </w:rPr>
-        <w:t>Version  1.3f</w:t>
+        <w:t>Version  1.3g</w:t>
       </w:r>
     </w:p>
     <w:p>
@@ -225,6 +225,26 @@
             </w:rPr>
             <w:fldChar w:fldCharType="separate"/>
           </w:r>
+          <w:hyperlink w:anchor="__RefHeading___Toc1370_30329480061">
+            <w:r>
+              <w:rPr>
+                <w:rStyle w:val="IndexLink"/>
+              </w:rPr>
+              <w:t>Executive Summary</w:t>
+              <w:tab/>
+              <w:t>4</w:t>
+            </w:r>
+          </w:hyperlink>
+        </w:p>
+        <w:p>
+          <w:pPr>
+            <w:pStyle w:val="Contents1"/>
+            <w:tabs>
+              <w:tab w:val="clear" w:pos="12960"/>
+              <w:tab w:val="right" w:pos="9360" w:leader="dot"/>
+            </w:tabs>
+            <w:rPr/>
+          </w:pPr>
           <w:hyperlink w:anchor="__RefHeading___Toc1370_3032948006">
             <w:r>
               <w:rPr>
@@ -232,7 +252,7 @@
               </w:rPr>
               <w:t>Colorado River Foundational Principles, What do we fight for. V0.5</w:t>
               <w:tab/>
-              <w:t>4</w:t>
+              <w:t>5</w:t>
             </w:r>
           </w:hyperlink>
         </w:p>
@@ -252,7 +272,7 @@
               </w:rPr>
               <w:t>Disclaimer</w:t>
               <w:tab/>
-              <w:t>5</w:t>
+              <w:t>6</w:t>
             </w:r>
           </w:hyperlink>
         </w:p>
@@ -272,7 +292,7 @@
               </w:rPr>
               <w:t>Operations, Accounting and NEPA</w:t>
               <w:tab/>
-              <w:t>5</w:t>
+              <w:t>6</w:t>
             </w:r>
           </w:hyperlink>
         </w:p>
@@ -292,7 +312,7 @@
               </w:rPr>
               <w:t>Colorado River System Accounting</w:t>
               <w:tab/>
-              <w:t>5</w:t>
+              <w:t>6</w:t>
             </w:r>
           </w:hyperlink>
         </w:p>
@@ -312,7 +332,7 @@
               </w:rPr>
               <w:t>Gila River Accounting Transparency</w:t>
               <w:tab/>
-              <w:t>5</w:t>
+              <w:t>6</w:t>
             </w:r>
           </w:hyperlink>
         </w:p>
@@ -332,7 +352,7 @@
               </w:rPr>
               <w:t>The Math Dataset</w:t>
               <w:tab/>
-              <w:t>5</w:t>
+              <w:t>6</w:t>
             </w:r>
           </w:hyperlink>
         </w:p>
@@ -352,7 +372,7 @@
               </w:rPr>
               <w:t>Table 1 – The Math</w:t>
               <w:tab/>
-              <w:t>6</w:t>
+              <w:t>7</w:t>
             </w:r>
           </w:hyperlink>
         </w:p>
@@ -372,7 +392,7 @@
               </w:rPr>
               <w:t>Lower Basin Annual Report Accessibility</w:t>
               <w:tab/>
-              <w:t>8</w:t>
+              <w:t>9</w:t>
             </w:r>
           </w:hyperlink>
         </w:p>
@@ -392,7 +412,7 @@
               </w:rPr>
               <w:t>CRBFC Lake Powell Inflow Forecasts</w:t>
               <w:tab/>
-              <w:t>8</w:t>
+              <w:t>9</w:t>
             </w:r>
           </w:hyperlink>
         </w:p>
@@ -412,7 +432,7 @@
               </w:rPr>
               <w:t>Run-of-the-River Operations at Glen Canyon Dam</w:t>
               <w:tab/>
-              <w:t>9</w:t>
+              <w:t>10</w:t>
             </w:r>
           </w:hyperlink>
         </w:p>
@@ -430,9 +450,9 @@
               <w:rPr>
                 <w:rStyle w:val="IndexLink"/>
               </w:rPr>
-              <w:t>Powell Infrastructure Protection &amp; Compact Compliance Pool</w:t>
+              <w:t>Compact Compliance Infrastructure Protection Pool (CCIPP)</w:t>
               <w:tab/>
-              <w:t>12</w:t>
+              <w:t>14</w:t>
             </w:r>
           </w:hyperlink>
         </w:p>
@@ -452,7 +472,7 @@
               </w:rPr>
               <w:t>Power Water Stranded and Potentially Stranded</w:t>
               <w:tab/>
-              <w:t>13</w:t>
+              <w:t>15</w:t>
             </w:r>
           </w:hyperlink>
         </w:p>
@@ -472,7 +492,7 @@
               </w:rPr>
               <w:t>Our Alternatives</w:t>
               <w:tab/>
-              <w:t>15</w:t>
+              <w:t>17</w:t>
             </w:r>
           </w:hyperlink>
         </w:p>
@@ -492,7 +512,7 @@
               </w:rPr>
               <w:t>A New Era of Cooperation</w:t>
               <w:tab/>
-              <w:t>16</w:t>
+              <w:t>19</w:t>
             </w:r>
           </w:hyperlink>
         </w:p>
@@ -512,7 +532,7 @@
               </w:rPr>
               <w:t>The Salton Sea Problem</w:t>
               <w:tab/>
-              <w:t>16</w:t>
+              <w:t>19</w:t>
             </w:r>
           </w:hyperlink>
         </w:p>
@@ -532,7 +552,7 @@
               </w:rPr>
               <w:t>Lower Basin Aquifer Utilization</w:t>
               <w:tab/>
-              <w:t>18</w:t>
+              <w:t>21</w:t>
             </w:r>
           </w:hyperlink>
         </w:p>
@@ -552,7 +572,7 @@
               </w:rPr>
               <w:t>Fire Deficit In Our Forests</w:t>
               <w:tab/>
-              <w:t>19</w:t>
+              <w:t>22</w:t>
             </w:r>
           </w:hyperlink>
         </w:p>
@@ -572,7 +592,7 @@
               </w:rPr>
               <w:t>Upper Basin Irrigation Efficiency</w:t>
               <w:tab/>
-              <w:t>19</w:t>
+              <w:t>22</w:t>
             </w:r>
           </w:hyperlink>
         </w:p>
@@ -592,7 +612,7 @@
               </w:rPr>
               <w:t>Desalination</w:t>
               <w:tab/>
-              <w:t>19</w:t>
+              <w:t>22</w:t>
             </w:r>
           </w:hyperlink>
         </w:p>
@@ -612,7 +632,7 @@
               </w:rPr>
               <w:t>Litigation Issues Which Directly Impact Current Operations</w:t>
               <w:tab/>
-              <w:t>20</w:t>
+              <w:t>23</w:t>
             </w:r>
           </w:hyperlink>
         </w:p>
@@ -632,7 +652,7 @@
               </w:rPr>
               <w:t>Section 603</w:t>
               <w:tab/>
-              <w:t>20</w:t>
+              <w:t>23</w:t>
             </w:r>
           </w:hyperlink>
         </w:p>
@@ -652,7 +672,7 @@
               </w:rPr>
               <w:t>Article III(c) Interpretation</w:t>
               <w:tab/>
-              <w:t>23</w:t>
+              <w:t>26</w:t>
             </w:r>
           </w:hyperlink>
         </w:p>
@@ -672,7 +692,7 @@
               </w:rPr>
               <w:t>Background – This is Complicated, Sorry</w:t>
               <w:tab/>
-              <w:t>23</w:t>
+              <w:t>26</w:t>
             </w:r>
           </w:hyperlink>
         </w:p>
@@ -692,7 +712,7 @@
               </w:rPr>
               <w:t>Scenario 1 - Status Quo, 2007 Interim Guidelines</w:t>
               <w:tab/>
-              <w:t>27</w:t>
+              <w:t>30</w:t>
             </w:r>
           </w:hyperlink>
         </w:p>
@@ -712,7 +732,7 @@
               </w:rPr>
               <w:t>Scenario 2 – Beneficial Consumptive Use Based</w:t>
               <w:tab/>
-              <w:t>28</w:t>
+              <w:t>31</w:t>
             </w:r>
           </w:hyperlink>
         </w:p>
@@ -732,7 +752,7 @@
               </w:rPr>
               <w:t>Scenario 3 – Supply Based</w:t>
               <w:tab/>
-              <w:t>30</w:t>
+              <w:t>33</w:t>
             </w:r>
           </w:hyperlink>
         </w:p>
@@ -752,7 +772,7 @@
               </w:rPr>
               <w:t>Article III(e) Interpretation</w:t>
               <w:tab/>
-              <w:t>32</w:t>
+              <w:t>35</w:t>
             </w:r>
           </w:hyperlink>
         </w:p>
@@ -778,7 +798,7 @@
               </w:rPr>
               <w:t>Lower Basin Aquifer Storage Summary</w:t>
               <w:tab/>
-              <w:t>36</w:t>
+              <w:t>39</w:t>
             </w:r>
           </w:hyperlink>
         </w:p>
@@ -798,7 +818,7 @@
               </w:rPr>
               <w:t>Canonical Legal Arguments Related to Operational Questions</w:t>
               <w:tab/>
-              <w:t>36</w:t>
+              <w:t>39</w:t>
             </w:r>
           </w:hyperlink>
         </w:p>
@@ -818,7 +838,7 @@
               </w:rPr>
               <w:t>Article III(d)</w:t>
               <w:tab/>
-              <w:t>36</w:t>
+              <w:t>39</w:t>
             </w:r>
           </w:hyperlink>
         </w:p>
@@ -838,7 +858,7 @@
               </w:rPr>
               <w:t>Article III(b)</w:t>
               <w:tab/>
-              <w:t>38</w:t>
+              <w:t>41</w:t>
             </w:r>
           </w:hyperlink>
         </w:p>
@@ -858,7 +878,7 @@
               </w:rPr>
               <w:t>Gila River</w:t>
               <w:tab/>
-              <w:t>39</w:t>
+              <w:t>42</w:t>
             </w:r>
           </w:hyperlink>
           <w:r>
@@ -890,13 +910,13 @@
           <w:rFonts w:ascii="Liberation Sans" w:hAnsi="Liberation Sans"/>
         </w:rPr>
       </w:pPr>
-      <w:bookmarkStart w:id="0" w:name="__RefHeading___Toc1370_3032948006"/>
+      <w:bookmarkStart w:id="0" w:name="__RefHeading___Toc1370_30329480061"/>
       <w:bookmarkEnd w:id="0"/>
       <w:r>
         <w:rPr>
           <w:rFonts w:ascii="Liberation Sans" w:hAnsi="Liberation Sans"/>
         </w:rPr>
-        <w:t>Colorado River Foundational Principles, What do we fight for.   V0.5</w:t>
+        <w:t>Executive Summary</w:t>
       </w:r>
     </w:p>
     <w:p>
@@ -904,7 +924,147 @@
         <w:pStyle w:val="Normal"/>
         <w:numPr>
           <w:ilvl w:val="0"/>
-          <w:numId w:val="4"/>
+          <w:numId w:val="1"/>
+        </w:numPr>
+        <w:spacing w:before="480" w:after="0"/>
+        <w:rPr/>
+      </w:pPr>
+      <w:r>
+        <w:rPr/>
+        <w:t>We ask the Bureau choose No Alternative or Basic Coordination to operate the River</w:t>
+      </w:r>
+    </w:p>
+    <w:p>
+      <w:pPr>
+        <w:pStyle w:val="Normal"/>
+        <w:numPr>
+          <w:ilvl w:val="0"/>
+          <w:numId w:val="1"/>
+        </w:numPr>
+        <w:spacing w:before="480" w:after="0"/>
+        <w:rPr/>
+      </w:pPr>
+      <w:r>
+        <w:rPr/>
+        <w:t>In light of the LaFond 2024 memo it appear imperative the Bureau be prepared to switch to Run of the River with annualized flow matching to protect power head and infrastructure at which point releases from Powell would be based on what the River provides</w:t>
+      </w:r>
+    </w:p>
+    <w:p>
+      <w:pPr>
+        <w:pStyle w:val="Normal"/>
+        <w:numPr>
+          <w:ilvl w:val="0"/>
+          <w:numId w:val="1"/>
+        </w:numPr>
+        <w:spacing w:before="480" w:after="0"/>
+        <w:rPr/>
+      </w:pPr>
+      <w:r>
+        <w:rPr/>
+        <w:t>We offer a novel interpretation of how III(c) surplus/deficit is calculated that fundamentally improves and corrections the current flawed Arizona interpretation in the 2007 Interim guidelines and maybe even in Section 602 and LROC</w:t>
+      </w:r>
+    </w:p>
+    <w:p>
+      <w:pPr>
+        <w:pStyle w:val="Normal"/>
+        <w:numPr>
+          <w:ilvl w:val="0"/>
+          <w:numId w:val="1"/>
+        </w:numPr>
+        <w:spacing w:before="480" w:after="0"/>
+        <w:rPr/>
+      </w:pPr>
+      <w:r>
+        <w:rPr/>
+        <w:t>We propose a new Compact Compliance and Infrastructure Protection Pool(CCIPP), pronounced sip.  This pool could hold stranded Upper Basin water rights like Ute Animas La Plata water and shuttered power plant water like Nucla and San Juan. This is not a lot of water but over time could be and would help protect infrastructure</w:t>
+      </w:r>
+    </w:p>
+    <w:p>
+      <w:pPr>
+        <w:pStyle w:val="Normal"/>
+        <w:numPr>
+          <w:ilvl w:val="0"/>
+          <w:numId w:val="1"/>
+        </w:numPr>
+        <w:spacing w:before="480" w:after="0"/>
+        <w:rPr/>
+      </w:pPr>
+      <w:r>
+        <w:rPr/>
+        <w:t>The Lower Basin seems to have horded 9-14 MAF of Colorado River water in aquifers which seems to run counter to III(e) since the water isn’t being put to beneficial consumptive use.   By taking this water from reservoirs it appears they may have contributed to the demise of Lake Powell and are pushing the Upper Basin toward compact non-compliance which seems to invoke Section 603.  We ask the Bureau and Lower Basin to develop a plan to tap this water immediately to bridge the River through the looming crisis when Lake Powell goes on Run of the River.</w:t>
+      </w:r>
+    </w:p>
+    <w:p>
+      <w:pPr>
+        <w:pStyle w:val="Normal"/>
+        <w:numPr>
+          <w:ilvl w:val="0"/>
+          <w:numId w:val="1"/>
+        </w:numPr>
+        <w:spacing w:before="480" w:after="0"/>
+        <w:rPr/>
+      </w:pPr>
+      <w:r>
+        <w:rPr/>
+        <w:t>We proposed a number of vital accounting and forecasting improvements to help us get through the looming crisis.  For the river to work the Math has to work.</w:t>
+      </w:r>
+    </w:p>
+    <w:p>
+      <w:pPr>
+        <w:pStyle w:val="Normal"/>
+        <w:numPr>
+          <w:ilvl w:val="0"/>
+          <w:numId w:val="1"/>
+        </w:numPr>
+        <w:spacing w:before="480" w:after="0"/>
+        <w:rPr/>
+      </w:pPr>
+      <w:r>
+        <w:rPr/>
+        <w:t>Its imperative the wall in Article III(a) between the basins be protected and that no inter basin marketing or transfers occur.</w:t>
+      </w:r>
+    </w:p>
+    <w:p>
+      <w:pPr>
+        <w:pStyle w:val="Normal"/>
+        <w:numPr>
+          <w:ilvl w:val="0"/>
+          <w:numId w:val="1"/>
+        </w:numPr>
+        <w:spacing w:before="480" w:after="0"/>
+        <w:rPr/>
+      </w:pPr>
+      <w:r>
+        <w:rPr/>
+        <w:t>We propose some solutions to the looming crisis for further discussion.</w:t>
+      </w:r>
+      <w:r>
+        <w:br w:type="page"/>
+      </w:r>
+    </w:p>
+    <w:p>
+      <w:pPr>
+        <w:pStyle w:val="Heading1"/>
+        <w:spacing w:before="480" w:after="0"/>
+        <w:rPr>
+          <w:rFonts w:ascii="Liberation Sans" w:hAnsi="Liberation Sans"/>
+        </w:rPr>
+      </w:pPr>
+      <w:bookmarkStart w:id="1" w:name="__RefHeading___Toc1370_3032948006"/>
+      <w:bookmarkEnd w:id="1"/>
+      <w:r>
+        <w:rPr>
+          <w:rFonts w:ascii="Liberation Sans" w:hAnsi="Liberation Sans"/>
+        </w:rPr>
+        <w:t>Colorado River Foundational Principles, What do we fight for.   V0.5</w:t>
+      </w:r>
+    </w:p>
+    <w:p>
+      <w:pPr>
+        <w:pStyle w:val="Normal"/>
+        <w:numPr>
+          <w:ilvl w:val="0"/>
+          <w:numId w:val="5"/>
         </w:numPr>
         <w:spacing w:before="0" w:after="0"/>
         <w:rPr/>
@@ -937,7 +1097,7 @@
         <w:pStyle w:val="Normal"/>
         <w:numPr>
           <w:ilvl w:val="0"/>
-          <w:numId w:val="4"/>
+          <w:numId w:val="5"/>
         </w:numPr>
         <w:spacing w:before="0" w:after="0"/>
         <w:rPr>
@@ -959,7 +1119,7 @@
         <w:pStyle w:val="Normal"/>
         <w:numPr>
           <w:ilvl w:val="0"/>
-          <w:numId w:val="4"/>
+          <w:numId w:val="5"/>
         </w:numPr>
         <w:spacing w:before="0" w:after="0"/>
         <w:rPr>
@@ -988,7 +1148,7 @@
         <w:pStyle w:val="Normal"/>
         <w:numPr>
           <w:ilvl w:val="0"/>
-          <w:numId w:val="4"/>
+          <w:numId w:val="5"/>
         </w:numPr>
         <w:spacing w:before="0" w:after="0"/>
         <w:rPr/>
@@ -1010,7 +1170,7 @@
         <w:pStyle w:val="Normal"/>
         <w:numPr>
           <w:ilvl w:val="0"/>
-          <w:numId w:val="4"/>
+          <w:numId w:val="5"/>
         </w:numPr>
         <w:spacing w:before="0" w:after="0"/>
         <w:rPr>
@@ -1039,7 +1199,7 @@
         <w:pStyle w:val="Normal"/>
         <w:numPr>
           <w:ilvl w:val="0"/>
-          <w:numId w:val="4"/>
+          <w:numId w:val="5"/>
         </w:numPr>
         <w:spacing w:before="0" w:after="0"/>
         <w:rPr/>
@@ -1061,7 +1221,7 @@
         <w:pStyle w:val="Normal"/>
         <w:numPr>
           <w:ilvl w:val="0"/>
-          <w:numId w:val="4"/>
+          <w:numId w:val="5"/>
         </w:numPr>
         <w:spacing w:before="0" w:after="0"/>
         <w:rPr/>
@@ -1094,7 +1254,7 @@
         <w:pStyle w:val="Normal"/>
         <w:numPr>
           <w:ilvl w:val="0"/>
-          <w:numId w:val="4"/>
+          <w:numId w:val="5"/>
         </w:numPr>
         <w:spacing w:before="0" w:after="0"/>
         <w:rPr/>
@@ -1116,7 +1276,7 @@
         <w:pStyle w:val="Normal"/>
         <w:numPr>
           <w:ilvl w:val="0"/>
-          <w:numId w:val="4"/>
+          <w:numId w:val="5"/>
         </w:numPr>
         <w:spacing w:before="0" w:after="0"/>
         <w:rPr>
@@ -1145,7 +1305,7 @@
         <w:pStyle w:val="Normal"/>
         <w:numPr>
           <w:ilvl w:val="0"/>
-          <w:numId w:val="4"/>
+          <w:numId w:val="5"/>
         </w:numPr>
         <w:spacing w:before="0" w:after="0"/>
         <w:rPr>
@@ -1174,7 +1334,7 @@
         <w:pStyle w:val="Normal"/>
         <w:numPr>
           <w:ilvl w:val="0"/>
-          <w:numId w:val="4"/>
+          <w:numId w:val="5"/>
         </w:numPr>
         <w:spacing w:before="0" w:after="0"/>
         <w:rPr/>
@@ -1254,8 +1414,8 @@
         <w:pStyle w:val="Heading1"/>
         <w:rPr/>
       </w:pPr>
-      <w:bookmarkStart w:id="1" w:name="__RefHeading___Toc10024_4147804815"/>
-      <w:bookmarkEnd w:id="1"/>
+      <w:bookmarkStart w:id="2" w:name="__RefHeading___Toc10024_4147804815"/>
+      <w:bookmarkEnd w:id="2"/>
       <w:r>
         <w:rPr/>
         <w:t>Disclaimer</w:t>
@@ -1280,8 +1440,8 @@
         <w:pStyle w:val="Heading1"/>
         <w:rPr/>
       </w:pPr>
-      <w:bookmarkStart w:id="2" w:name="__RefHeading___Toc755_3032948006"/>
-      <w:bookmarkEnd w:id="2"/>
+      <w:bookmarkStart w:id="3" w:name="__RefHeading___Toc755_3032948006"/>
+      <w:bookmarkEnd w:id="3"/>
       <w:r>
         <w:rPr/>
         <w:t>Operations, Accounting and NEPA</w:t>
@@ -1292,8 +1452,8 @@
         <w:pStyle w:val="Heading2"/>
         <w:rPr/>
       </w:pPr>
-      <w:bookmarkStart w:id="3" w:name="__RefHeading___Toc638_3032085257"/>
-      <w:bookmarkEnd w:id="3"/>
+      <w:bookmarkStart w:id="4" w:name="__RefHeading___Toc638_3032085257"/>
+      <w:bookmarkEnd w:id="4"/>
       <w:r>
         <w:rPr/>
         <w:t>Colorado River System Accounting</w:t>
@@ -1339,8 +1499,8 @@
         <w:pStyle w:val="Heading3"/>
         <w:rPr/>
       </w:pPr>
-      <w:bookmarkStart w:id="4" w:name="__RefHeading___Toc10036_4147804815"/>
-      <w:bookmarkEnd w:id="4"/>
+      <w:bookmarkStart w:id="5" w:name="__RefHeading___Toc10036_4147804815"/>
+      <w:bookmarkEnd w:id="5"/>
       <w:r>
         <w:rPr/>
         <w:t>Gila River Accounting Transparency</w:t>
@@ -1385,8 +1545,8 @@
         <w:pStyle w:val="Heading3"/>
         <w:rPr/>
       </w:pPr>
-      <w:bookmarkStart w:id="5" w:name="__RefHeading___Toc10038_4147804815"/>
-      <w:bookmarkEnd w:id="5"/>
+      <w:bookmarkStart w:id="6" w:name="__RefHeading___Toc10038_4147804815"/>
+      <w:bookmarkEnd w:id="6"/>
       <w:r>
         <w:rPr/>
         <w:t>The Math Dataset</w:t>
@@ -1407,8 +1567,8 @@
         <w:pStyle w:val="Heading3"/>
         <w:rPr/>
       </w:pPr>
-      <w:bookmarkStart w:id="6" w:name="__RefHeading___Toc10048_4147804815"/>
-      <w:bookmarkEnd w:id="6"/>
+      <w:bookmarkStart w:id="7" w:name="__RefHeading___Toc10048_4147804815"/>
+      <w:bookmarkEnd w:id="7"/>
       <w:r>
         <w:rPr/>
         <w:t>Table 1 – The Math</w:t>
@@ -1519,7 +1679,7 @@
             <v:imagedata r:id="rId5" o:title=""/>
             <w10:wrap type="square"/>
           </v:shape>
-          <o:OLEObject Type="Embed" ProgID="Excel.Sheet.12" ShapeID="ole_rId4" DrawAspect="Content" ObjectID="_1837458775" r:id="rId4"/>
+          <o:OLEObject Type="Embed" ProgID="Excel.Sheet.12" ShapeID="ole_rId4" DrawAspect="Content" ObjectID="_1283943796" r:id="rId4"/>
         </w:object>
       </w:r>
       <w:r>
@@ -1531,8 +1691,8 @@
         <w:pStyle w:val="Heading3"/>
         <w:rPr/>
       </w:pPr>
-      <w:bookmarkStart w:id="7" w:name="__RefHeading___Toc10040_4147804815"/>
-      <w:bookmarkEnd w:id="7"/>
+      <w:bookmarkStart w:id="8" w:name="__RefHeading___Toc10040_4147804815"/>
+      <w:bookmarkEnd w:id="8"/>
       <w:r>
         <w:rPr/>
         <w:t>Lower Basin Annual Report Accessibility</w:t>
@@ -1586,8 +1746,8 @@
           <w:bCs/>
         </w:rPr>
       </w:pPr>
-      <w:bookmarkStart w:id="8" w:name="__RefHeading___Toc5829_4147804815"/>
-      <w:bookmarkEnd w:id="8"/>
+      <w:bookmarkStart w:id="9" w:name="__RefHeading___Toc5829_4147804815"/>
+      <w:bookmarkEnd w:id="9"/>
       <w:r>
         <w:rPr/>
         <w:t>CRBFC Lake Powell Inflow Forecasts</w:t>
@@ -1679,8 +1839,8 @@
         <w:pStyle w:val="Heading2"/>
         <w:rPr/>
       </w:pPr>
-      <w:bookmarkStart w:id="9" w:name="__RefHeading___Toc757_3032948006"/>
-      <w:bookmarkEnd w:id="9"/>
+      <w:bookmarkStart w:id="10" w:name="__RefHeading___Toc757_3032948006"/>
+      <w:bookmarkEnd w:id="10"/>
       <w:r>
         <w:rPr/>
         <w:t>Run-of-the-River Operations at Glen Canyon Dam</w:t>
@@ -2175,45 +2335,78 @@
       <w:r>
         <w:rPr/>
       </w:r>
+      <w:r>
+        <w:br w:type="page"/>
+      </w:r>
     </w:p>
     <w:p>
       <w:pPr>
         <w:pStyle w:val="Heading2"/>
         <w:rPr/>
       </w:pPr>
-      <w:bookmarkStart w:id="10" w:name="__RefHeading___Toc640_3032085257"/>
-      <w:bookmarkEnd w:id="10"/>
-      <w:r>
-        <w:rPr/>
-        <w:t>Powell Infrastructure Protection &amp; Compact Compliance Pool</w:t>
-      </w:r>
-    </w:p>
-    <w:p>
-      <w:pPr>
-        <w:pStyle w:val="Normal"/>
-        <w:rPr/>
-      </w:pPr>
-      <w:r>
-        <w:rPr/>
-        <w:t xml:space="preserve">Three circumstances require establishment of a new pool in Lake Powell immediately, with or without Seven States agreement. This is a kind of gap water: </w:t>
-      </w:r>
-    </w:p>
-    <w:p>
-      <w:pPr>
-        <w:pStyle w:val="Normal"/>
-        <w:ind w:left="720" w:hanging="0"/>
-        <w:rPr>
-          <w:b/>
+      <w:bookmarkStart w:id="11" w:name="__RefHeading___Toc640_3032085257"/>
+      <w:bookmarkEnd w:id="11"/>
+      <w:r>
+        <w:rPr/>
+        <w:t xml:space="preserve">Compact Compliance Infrastructure Protection Pool </w:t>
+      </w:r>
+      <w:r>
+        <w:rPr/>
+        <w:t>(CCIPP)</w:t>
+      </w:r>
+      <w:r>
+        <w:rPr/>
+        <w:t xml:space="preserve"> </w:t>
+      </w:r>
+    </w:p>
+    <w:p>
+      <w:pPr>
+        <w:pStyle w:val="Normal"/>
+        <w:rPr/>
+      </w:pPr>
+      <w:r>
+        <w:rPr/>
+        <w:t xml:space="preserve">Three circumstances require establishment of a new pool in Lake Powell immediately, with or without Seven States agreement. This is a kind of gap water </w:t>
+      </w:r>
+      <w:r>
+        <w:rPr/>
+        <w:t>but actually real. Its pronounced “sip”</w:t>
+      </w:r>
+      <w:r>
+        <w:rPr/>
+        <w:t xml:space="preserve">: </w:t>
+      </w:r>
+    </w:p>
+    <w:p>
+      <w:pPr>
+        <w:pStyle w:val="Normal"/>
+        <w:spacing w:before="0" w:after="0"/>
+        <w:rPr/>
+      </w:pPr>
+      <w:r>
+        <w:rPr>
           <w:b/>
           <w:bCs/>
         </w:rPr>
-      </w:pPr>
+        <w:t xml:space="preserve">Compact Compliance Pool Infrastructure Protection </w:t>
+      </w:r>
       <w:r>
         <w:rPr>
           <w:b/>
           <w:bCs/>
         </w:rPr>
-        <w:t>Infrastructure Protection and Compact Compliance Pool</w:t>
+        <w:t>Pool</w:t>
+      </w:r>
+      <w:r>
+        <w:rPr>
+          <w:b/>
+          <w:bCs/>
+        </w:rPr>
+        <w:t xml:space="preserve"> </w:t>
+      </w:r>
+      <w:r>
+        <w:rPr/>
+        <w:br/>
       </w:r>
     </w:p>
     <w:p>
@@ -2227,7 +2420,31 @@
       </w:pPr>
       <w:r>
         <w:rPr/>
-        <w:t>It is imperative power head be protected at elevation 3510’ in light of the LaFond memo above. A pool buffering this elevation is required.  A safety margin is needed if extended Run of The River operations are required.  USBR should really like this pool right now.</w:t>
+        <w:t xml:space="preserve">It is imperative power head be protected at elevation 3510’ in light of the </w:t>
+      </w:r>
+      <w:r>
+        <w:rPr/>
+        <w:t>USBR</w:t>
+      </w:r>
+      <w:r>
+        <w:rPr/>
+        <w:t xml:space="preserve"> LaFond </w:t>
+      </w:r>
+      <w:r>
+        <w:rPr/>
+        <w:t>2024</w:t>
+      </w:r>
+      <w:r>
+        <w:rPr/>
+        <w:t xml:space="preserve"> memo.  </w:t>
+      </w:r>
+      <w:r>
+        <w:rPr/>
+        <w:t>Bypass tubes can not safely run the river</w:t>
+      </w:r>
+      <w:r>
+        <w:rPr/>
+        <w:t>. A pool buffering this elevation is required.  A safety margin is needed if extended Run of The River operations are required.  USBR should really like this pool right now.</w:t>
       </w:r>
     </w:p>
     <w:p>
@@ -2251,6 +2468,7 @@
           <w:ilvl w:val="0"/>
           <w:numId w:val="2"/>
         </w:numPr>
+        <w:spacing w:before="0" w:after="0"/>
         <w:rPr/>
       </w:pPr>
       <w:r>
@@ -2274,6 +2492,16 @@
       <w:pPr>
         <w:pStyle w:val="Normal"/>
         <w:spacing w:before="0" w:after="0"/>
+        <w:rPr/>
+      </w:pPr>
+      <w:r>
+        <w:rPr/>
+      </w:r>
+    </w:p>
+    <w:p>
+      <w:pPr>
+        <w:pStyle w:val="Normal"/>
+        <w:spacing w:before="0" w:after="0"/>
         <w:ind w:left="0" w:hanging="0"/>
         <w:rPr/>
       </w:pPr>
@@ -2291,6 +2519,10 @@
       </w:pPr>
       <w:r>
         <w:rPr/>
+        <w:t xml:space="preserve"> </w:t>
+      </w:r>
+      <w:r>
+        <w:rPr/>
         <w:t>32,000 AFY Animas La Plata Settled Tribal Winters water rights</w:t>
       </w:r>
     </w:p>
@@ -2303,7 +2535,11 @@
       </w:pPr>
       <w:r>
         <w:rPr/>
-        <w:t>55,000-65,000 AFY Power plants when all are shut (last is 2038)</w:t>
+        <w:t xml:space="preserve">   </w:t>
+      </w:r>
+      <w:r>
+        <w:rPr/>
+        <w:t>5,000 AFY Nucla</w:t>
       </w:r>
     </w:p>
     <w:p>
@@ -2315,7 +2551,11 @@
       </w:pPr>
       <w:r>
         <w:rPr/>
-        <w:t xml:space="preserve">87,000-97,000 AFY Totaling </w:t>
+        <w:t xml:space="preserve">   </w:t>
+      </w:r>
+      <w:r>
+        <w:rPr/>
+        <w:t>8,000 AFY San Juan</w:t>
       </w:r>
     </w:p>
     <w:p>
@@ -2323,6 +2563,82 @@
         <w:pStyle w:val="Normal"/>
         <w:spacing w:before="0" w:after="0"/>
         <w:ind w:left="720" w:hanging="0"/>
+        <w:rPr/>
+      </w:pPr>
+      <w:r>
+        <w:rPr/>
+        <w:t xml:space="preserve"> </w:t>
+      </w:r>
+      <w:r>
+        <w:rPr/>
+        <w:t>45,000 AFY Subtotal</w:t>
+      </w:r>
+    </w:p>
+    <w:p>
+      <w:pPr>
+        <w:pStyle w:val="Normal"/>
+        <w:spacing w:before="0" w:after="0"/>
+        <w:ind w:left="720" w:hanging="0"/>
+        <w:rPr/>
+      </w:pPr>
+      <w:r>
+        <w:rPr/>
+        <w:t xml:space="preserve"> </w:t>
+      </w:r>
+      <w:r>
+        <w:rPr/>
+        <w:t>30,000 AFY Navajo</w:t>
+      </w:r>
+    </w:p>
+    <w:p>
+      <w:pPr>
+        <w:pStyle w:val="Normal"/>
+        <w:spacing w:before="0" w:after="0"/>
+        <w:ind w:left="720" w:hanging="0"/>
+        <w:rPr/>
+      </w:pPr>
+      <w:r>
+        <w:rPr/>
+        <w:t xml:space="preserve"> </w:t>
+      </w:r>
+      <w:r>
+        <w:rPr/>
+        <w:t>75,000 AFY Subtotal</w:t>
+      </w:r>
+    </w:p>
+    <w:p>
+      <w:pPr>
+        <w:pStyle w:val="Normal"/>
+        <w:spacing w:before="0" w:after="0"/>
+        <w:ind w:left="720" w:hanging="0"/>
+        <w:rPr/>
+      </w:pPr>
+      <w:r>
+        <w:rPr/>
+        <w:t xml:space="preserve"> </w:t>
+      </w:r>
+      <w:r>
+        <w:rPr/>
+        <w:t>31,000 AFY Pending, don’t count on it</w:t>
+      </w:r>
+    </w:p>
+    <w:p>
+      <w:pPr>
+        <w:pStyle w:val="Normal"/>
+        <w:spacing w:before="0" w:after="0"/>
+        <w:ind w:left="720" w:hanging="0"/>
+        <w:rPr/>
+      </w:pPr>
+      <w:r>
+        <w:rPr/>
+        <w:t>106,000 AFY Total, don’t count on the last 31,000</w:t>
+      </w:r>
+    </w:p>
+    <w:p>
+      <w:pPr>
+        <w:pStyle w:val="Normal"/>
+        <w:spacing w:before="0" w:after="0"/>
+        <w:ind w:left="0" w:hanging="0"/>
         <w:rPr/>
       </w:pPr>
       <w:r>
@@ -2379,6 +2695,17 @@
     <w:p>
       <w:pPr>
         <w:pStyle w:val="Normal"/>
+        <w:spacing w:before="0" w:after="0"/>
+        <w:ind w:left="0" w:hanging="0"/>
+        <w:rPr/>
+      </w:pPr>
+      <w:r>
+        <w:rPr/>
+      </w:r>
+    </w:p>
+    <w:p>
+      <w:pPr>
+        <w:pStyle w:val="Normal"/>
         <w:numPr>
           <w:ilvl w:val="0"/>
           <w:numId w:val="1"/>
@@ -2388,7 +2715,7 @@
       </w:pPr>
       <w:r>
         <w:rPr/>
-        <w:t>Under no circumstances can water from this pool be sold to the Lower Basin or to USBR acting in its role as Lower Basin Water Master.  This would be an Article III(a) violation and compromise The Wall.  The Wall can not be compromised by this pool</w:t>
+        <w:t>The consumptive use required under III(a) is Powell evaporation, IANAL.</w:t>
       </w:r>
     </w:p>
     <w:p>
@@ -2403,7 +2730,7 @@
       </w:pPr>
       <w:r>
         <w:rPr/>
-        <w:t>Under no circumstances can this pool support or encourage speculation, its a Foundational Principal.</w:t>
+        <w:t>Under no circumstances can water from this pool be sold to the Lower Basin or to USBR acting in its role as Lower Basin Water Master.  This would be an Article III(a) violation and compromise The Wall.  The Wall can not be compromised by this pool</w:t>
       </w:r>
     </w:p>
     <w:p>
@@ -2418,7 +2745,7 @@
       </w:pPr>
       <w:r>
         <w:rPr/>
-        <w:t>Water rights which can participate in this pool must be carefully restricted to Ute ALP water and stranded power plant water for now.  It cant become a destination for buy and dried Ag water</w:t>
+        <w:t>Under no circumstances can this pool support or encourage speculation, its a Foundational Principal.</w:t>
       </w:r>
     </w:p>
     <w:p>
@@ -2433,7 +2760,7 @@
       </w:pPr>
       <w:r>
         <w:rPr/>
-        <w:t>Constraints must be developed on when this water is released from Lake Powell. Presumably it would ONLY be when there is a legally recognized compact compliance call.  UCRC would be first entity to proposed this, probably in consultation with the involved state and the water rights holder</w:t>
+        <w:t>Water rights which can participate in this pool must be carefully restricted to Ute ALP water and stranded power plant water for now.  It cant become a destination for buy and dried Ag water</w:t>
       </w:r>
     </w:p>
     <w:p>
@@ -2448,6 +2775,21 @@
       </w:pPr>
       <w:r>
         <w:rPr/>
+        <w:t>Constraints must be developed on when this water is released from Lake Powell. Presumably it would ONLY be when there is a legally recognized compact compliance call.  UCRC would be first entity to proposed this, probably in consultation with the involved state and the water rights holder</w:t>
+      </w:r>
+    </w:p>
+    <w:p>
+      <w:pPr>
+        <w:pStyle w:val="Normal"/>
+        <w:numPr>
+          <w:ilvl w:val="0"/>
+          <w:numId w:val="1"/>
+        </w:numPr>
+        <w:spacing w:before="0" w:after="0"/>
+        <w:rPr/>
+      </w:pPr>
+      <w:r>
+        <w:rPr/>
         <w:t>Careful consideration has to be given to how this water right can be monetized by the rights holder.  Most probably this would involve sale of the water release to an entity seeking compact compliance protection, like a city with junior water rights… BUT ONLY IN THE UPPER BASIN.  The water would be released to offset their curtailment obligation. Again this can not be allowed to be a buy and dry mechanism for Ag so the water rights eligible have to be closely controlled.</w:t>
       </w:r>
     </w:p>
@@ -2455,7 +2797,6 @@
       <w:pPr>
         <w:pStyle w:val="Normal"/>
         <w:spacing w:before="0" w:after="0"/>
-        <w:ind w:left="0" w:hanging="0"/>
         <w:rPr/>
       </w:pPr>
       <w:r>
@@ -2467,8 +2808,8 @@
         <w:pStyle w:val="Heading3"/>
         <w:rPr/>
       </w:pPr>
-      <w:bookmarkStart w:id="11" w:name="__RefHeading___Toc5661_4147804815"/>
-      <w:bookmarkEnd w:id="11"/>
+      <w:bookmarkStart w:id="12" w:name="__RefHeading___Toc5661_4147804815"/>
+      <w:bookmarkEnd w:id="12"/>
       <w:r>
         <w:rPr/>
         <w:t xml:space="preserve">Power Water Stranded and Potentially Stranded </w:t>
@@ -2589,12 +2930,7 @@
     <w:p>
       <w:pPr>
         <w:pStyle w:val="Normal"/>
-        <w:numPr>
-          <w:ilvl w:val="0"/>
-          <w:numId w:val="0"/>
-        </w:numPr>
-        <w:spacing w:before="0" w:after="0"/>
-        <w:ind w:left="227" w:hanging="0"/>
+        <w:spacing w:before="0" w:after="0"/>
         <w:rPr/>
       </w:pPr>
       <w:r>
@@ -2631,8 +2967,89 @@
       </w:pPr>
       <w:r>
         <w:rPr/>
+      </w:r>
+    </w:p>
+    <w:p>
+      <w:pPr>
+        <w:pStyle w:val="Normal"/>
+        <w:spacing w:before="0" w:after="0"/>
+        <w:rPr>
+          <w:rFonts w:ascii="sans-serif" w:hAnsi="sans-serif"/>
+          <w:color w:val="000000"/>
+          <w:shd w:fill="auto" w:val="clear"/>
+        </w:rPr>
+      </w:pPr>
+      <w:r>
+        <w:rPr>
+          <w:rFonts w:ascii="sans-serif" w:hAnsi="sans-serif"/>
+          <w:b/>
+          <w:bCs/>
+          <w:color w:val="000000"/>
+          <w:shd w:fill="auto" w:val="clear"/>
+        </w:rPr>
+        <w:t>Navajo Generating Statio</w:t>
+      </w:r>
+      <w:r>
+        <w:rPr>
+          <w:rFonts w:ascii="sans-serif" w:hAnsi="sans-serif"/>
+          <w:b/>
+          <w:bCs/>
+          <w:color w:val="000000"/>
+          <w:shd w:fill="auto" w:val="clear"/>
+        </w:rPr>
+        <w:t>n</w:t>
+      </w:r>
+      <w:r>
+        <w:rPr>
+          <w:rFonts w:ascii="sans-serif" w:hAnsi="sans-serif"/>
+          <w:color w:val="000000"/>
+          <w:shd w:fill="auto" w:val="clear"/>
+        </w:rPr>
+        <w:t xml:space="preserve">, now shuttered in Arizona had </w:t>
+      </w:r>
+      <w:r>
+        <w:rPr>
+          <w:rFonts w:ascii="sans-serif" w:hAnsi="sans-serif"/>
+          <w:color w:val="000000"/>
+          <w:shd w:fill="auto" w:val="clear"/>
+        </w:rPr>
+        <w:t xml:space="preserve">34,100 acre-feet </w:t>
+      </w:r>
+      <w:r>
+        <w:rPr>
+          <w:rFonts w:ascii="sans-serif" w:hAnsi="sans-serif"/>
+          <w:color w:val="000000"/>
+          <w:shd w:fill="auto" w:val="clear"/>
+        </w:rPr>
+        <w:t>under</w:t>
+      </w:r>
+      <w:r>
+        <w:rPr>
+          <w:rFonts w:ascii="sans-serif" w:hAnsi="sans-serif"/>
+          <w:color w:val="000000"/>
+          <w:shd w:fill="auto" w:val="clear"/>
+        </w:rPr>
+        <w:t xml:space="preserve"> long-term contractual consumptive use allocation approved in 1968 by the Navajo Tribal Council, </w:t>
+      </w:r>
+      <w:r>
+        <w:rPr>
+          <w:rFonts w:ascii="sans-serif" w:hAnsi="sans-serif"/>
+          <w:color w:val="000000"/>
+          <w:shd w:fill="auto" w:val="clear"/>
+        </w:rPr>
+        <w:t>it used about 20,000-28,000 af in practice.  Its not clear if Arizona would put this water in the CCIPP though.</w:t>
+      </w:r>
+    </w:p>
+    <w:p>
+      <w:pPr>
+        <w:pStyle w:val="Normal"/>
+        <w:spacing w:before="0" w:after="0"/>
+        <w:rPr/>
+      </w:pPr>
+      <w:r>
+        <w:rPr/>
         <w:br/>
-        <w:t>Scheduled Shutdowns (Water Use to Cease Upon Retirement)</w:t>
+        <w:t>Scheduled Shutdowns (Water Use to Cease Upon Retirement):</w:t>
         <w:br/>
       </w:r>
     </w:p>
@@ -2755,17 +3172,17 @@
       <w:r>
         <w:rPr/>
         <w:t xml:space="preserve"> (Utah, Green River): ~2030; ~6,700–7,600 AF/yr (average ~6,672 AF consumptive; primary right ~7,600 AF/yr).</w:t>
+      </w:r>
+    </w:p>
+    <w:p>
+      <w:pPr>
+        <w:pStyle w:val="Normal"/>
+        <w:spacing w:before="0" w:after="0"/>
+        <w:rPr/>
+      </w:pPr>
+      <w:r>
+        <w:rPr/>
         <w:br/>
-      </w:r>
-    </w:p>
-    <w:p>
-      <w:pPr>
-        <w:pStyle w:val="Normal"/>
-        <w:spacing w:before="0" w:after="0"/>
-        <w:rPr/>
-      </w:pPr>
-      <w:r>
-        <w:rPr/>
         <w:t>Subtotal for scheduled plants: ~44,000–53,000 AF/yr (phased realization, with most by 2030–2038; subject to delays from reliability needs or federal orders).</w:t>
         <w:br/>
         <w:t>Grand Total Upon Full Shutdown of Listed Plants</w:t>
@@ -2861,8 +3278,29 @@
       </w:pPr>
       <w:r>
         <w:rPr/>
-        <w:t>Schedules face uncertainty from demand growth (AI data centers), federal interventions, and economics; volumes are estimates from operational data, not fixed decrees in all cases.</w:t>
-        <w:br/>
+        <w:t xml:space="preserve">Closure </w:t>
+      </w:r>
+      <w:r>
+        <w:rPr/>
+        <w:t xml:space="preserve">Schedules face uncertainty from demand growth (AI data centers), federal interventions, and economics. </w:t>
+      </w:r>
+      <w:r>
+        <w:rPr/>
+        <w:t>V</w:t>
+      </w:r>
+      <w:r>
+        <w:rPr/>
+        <w:t>olumes are estimates from operational data, not fixed decrees in all cases.</w:t>
+      </w:r>
+    </w:p>
+    <w:p>
+      <w:pPr>
+        <w:pStyle w:val="Normal"/>
+        <w:spacing w:before="0" w:after="0"/>
+        <w:rPr/>
+      </w:pPr>
+      <w:r>
+        <w:rPr/>
       </w:r>
     </w:p>
     <w:p>
@@ -2870,8 +3308,8 @@
         <w:pStyle w:val="Heading3"/>
         <w:rPr/>
       </w:pPr>
-      <w:bookmarkStart w:id="12" w:name="__RefHeading___Toc1017_3744599050"/>
-      <w:bookmarkEnd w:id="12"/>
+      <w:bookmarkStart w:id="13" w:name="__RefHeading___Toc1017_3744599050"/>
+      <w:bookmarkEnd w:id="13"/>
       <w:r>
         <w:rPr/>
         <w:t>Our Alternatives</w:t>
@@ -2968,8 +3406,8 @@
         <w:pStyle w:val="Heading1"/>
         <w:rPr/>
       </w:pPr>
-      <w:bookmarkStart w:id="13" w:name="__RefHeading___Toc5663_4147804815"/>
-      <w:bookmarkEnd w:id="13"/>
+      <w:bookmarkStart w:id="14" w:name="__RefHeading___Toc5663_4147804815"/>
+      <w:bookmarkEnd w:id="14"/>
       <w:r>
         <w:drawing>
           <wp:anchor behindDoc="0" distT="0" distB="0" distL="0" distR="0" simplePos="0" locked="0" layoutInCell="0" allowOverlap="1" relativeHeight="3">
@@ -3027,8 +3465,8 @@
         <w:pStyle w:val="Heading2"/>
         <w:rPr/>
       </w:pPr>
-      <w:bookmarkStart w:id="14" w:name="__RefHeading___Toc5665_4147804815"/>
-      <w:bookmarkEnd w:id="14"/>
+      <w:bookmarkStart w:id="15" w:name="__RefHeading___Toc5665_4147804815"/>
+      <w:bookmarkEnd w:id="15"/>
       <w:r>
         <w:rPr/>
         <w:t>The Salton Sea Problem</w:t>
@@ -3244,7 +3682,7 @@
         <w:pStyle w:val="Normal"/>
         <w:numPr>
           <w:ilvl w:val="0"/>
-          <w:numId w:val="3"/>
+          <w:numId w:val="4"/>
         </w:numPr>
         <w:spacing w:before="0" w:after="0"/>
         <w:rPr/>
@@ -3274,7 +3712,7 @@
         <w:pStyle w:val="Normal"/>
         <w:numPr>
           <w:ilvl w:val="0"/>
-          <w:numId w:val="3"/>
+          <w:numId w:val="4"/>
         </w:numPr>
         <w:spacing w:before="0" w:after="0"/>
         <w:rPr/>
@@ -3393,7 +3831,7 @@
         <w:pStyle w:val="Normal"/>
         <w:numPr>
           <w:ilvl w:val="0"/>
-          <w:numId w:val="3"/>
+          <w:numId w:val="4"/>
         </w:numPr>
         <w:spacing w:before="0" w:after="0"/>
         <w:rPr/>
@@ -3408,7 +3846,7 @@
         <w:pStyle w:val="Normal"/>
         <w:numPr>
           <w:ilvl w:val="0"/>
-          <w:numId w:val="3"/>
+          <w:numId w:val="4"/>
         </w:numPr>
         <w:spacing w:before="0" w:after="0"/>
         <w:rPr/>
@@ -3459,7 +3897,7 @@
         <w:pStyle w:val="Normal"/>
         <w:numPr>
           <w:ilvl w:val="0"/>
-          <w:numId w:val="3"/>
+          <w:numId w:val="4"/>
         </w:numPr>
         <w:spacing w:before="0" w:after="0"/>
         <w:rPr/>
@@ -3474,7 +3912,7 @@
         <w:pStyle w:val="Normal"/>
         <w:numPr>
           <w:ilvl w:val="0"/>
-          <w:numId w:val="3"/>
+          <w:numId w:val="4"/>
         </w:numPr>
         <w:spacing w:before="0" w:after="0"/>
         <w:rPr/>
@@ -3489,7 +3927,7 @@
         <w:pStyle w:val="Normal"/>
         <w:numPr>
           <w:ilvl w:val="0"/>
-          <w:numId w:val="3"/>
+          <w:numId w:val="4"/>
         </w:numPr>
         <w:spacing w:before="0" w:after="0"/>
         <w:rPr/>
@@ -3705,8 +4143,8 @@
         <w:pStyle w:val="Heading2"/>
         <w:rPr/>
       </w:pPr>
-      <w:bookmarkStart w:id="15" w:name="__RefHeading___Toc5787_4147804815"/>
-      <w:bookmarkEnd w:id="15"/>
+      <w:bookmarkStart w:id="16" w:name="__RefHeading___Toc5787_4147804815"/>
+      <w:bookmarkEnd w:id="16"/>
       <w:r>
         <w:rPr/>
         <w:t>Lower Basin Aquifer Utilization</w:t>
@@ -3719,7 +4157,7 @@
       </w:pPr>
       <w:r>
         <w:rPr/>
-        <w:t>Lower Basin States have probably put 9 MAF of Colorado River water in underground aquifers for long storage rather than beneficial consumptive use as required by Article iii(e), drawing down reservoirs and pushing us into this crisis.  The accounting is so complex we aren;t sure of the number, but maybe a full year of Lower Basin supply.  We request the Lower Basin and USBR immediately develop a plan to rapidly draw down these reserves in the coming year to bridge the system through this crisis.  If this water was banked for a rainy day, or a drought, it would seem this would be it.  Putting this water back in the system, protecting power head in both Lake Mead and Lake Powell, and waiving compact noncompliance action on the Upper Basin would seem like the only appropriate way to make amends for this dubious practice.</w:t>
+        <w:t>Lower Basin States have at least 9 MAF of Colorado River water in underground aquifers for long storage rather than beneficial consumptive use as required by Article iii(e), drawing down reservoirs and pushing us into this crisis.  Kathryn Sorenson in a recent talk at UWI said its as much as 14 MAF. The accounting is so complex we aren’t sure of the number, but maybe a full year of Lower Basin supply.  We request the Lower Basin and USBR immediately develop a plan to rapidly draw down these reserves in the coming year to bridge the system through this crisis.  If this water was banked for a rainy day, or a drought, it would seem this would be it.  Putting this water back in the system, protecting power head in both Lake Mead and Lake Powell, and waiving compact noncompliance action on the Upper Basin would seem like the only appropriate way to make amends for this dubious practice.</w:t>
       </w:r>
     </w:p>
     <w:p>
@@ -3737,8 +4175,8 @@
         <w:pStyle w:val="Heading2"/>
         <w:rPr/>
       </w:pPr>
-      <w:bookmarkStart w:id="16" w:name="__RefHeading___Toc5789_4147804815"/>
-      <w:bookmarkEnd w:id="16"/>
+      <w:bookmarkStart w:id="17" w:name="__RefHeading___Toc5789_4147804815"/>
+      <w:bookmarkEnd w:id="17"/>
       <w:r>
         <w:rPr/>
         <w:t>Fire Deficit In Our Forests</w:t>
@@ -3780,8 +4218,8 @@
         <w:pStyle w:val="Heading2"/>
         <w:rPr/>
       </w:pPr>
-      <w:bookmarkStart w:id="17" w:name="__RefHeading___Toc5791_4147804815"/>
-      <w:bookmarkEnd w:id="17"/>
+      <w:bookmarkStart w:id="18" w:name="__RefHeading___Toc5791_4147804815"/>
+      <w:bookmarkEnd w:id="18"/>
       <w:r>
         <w:rPr/>
         <w:t>Upper Basin Irrigation Efficiency</w:t>
@@ -3806,8 +4244,8 @@
         <w:pStyle w:val="Heading2"/>
         <w:rPr/>
       </w:pPr>
-      <w:bookmarkStart w:id="18" w:name="__RefHeading___Toc5793_4147804815"/>
-      <w:bookmarkEnd w:id="18"/>
+      <w:bookmarkStart w:id="19" w:name="__RefHeading___Toc5793_4147804815"/>
+      <w:bookmarkEnd w:id="19"/>
       <w:r>
         <w:rPr/>
         <w:t>Desalination</w:t>
@@ -3840,8 +4278,8 @@
         <w:pStyle w:val="Heading1"/>
         <w:rPr/>
       </w:pPr>
-      <w:bookmarkStart w:id="19" w:name="__RefHeading___Toc759_3032948006"/>
-      <w:bookmarkEnd w:id="19"/>
+      <w:bookmarkStart w:id="20" w:name="__RefHeading___Toc759_3032948006"/>
+      <w:bookmarkEnd w:id="20"/>
       <w:r>
         <w:rPr/>
         <w:t>Litigation Issues Which Directly Impact Current Operations</w:t>
@@ -3871,8 +4309,8 @@
         <w:pStyle w:val="Heading2"/>
         <w:rPr/>
       </w:pPr>
-      <w:bookmarkStart w:id="20" w:name="__RefHeading___Toc5667_4147804815"/>
-      <w:bookmarkEnd w:id="20"/>
+      <w:bookmarkStart w:id="21" w:name="__RefHeading___Toc5667_4147804815"/>
+      <w:bookmarkEnd w:id="21"/>
       <w:r>
         <w:rPr/>
         <w:t>Section 603</w:t>
@@ -3932,7 +4370,7 @@
         <w:pStyle w:val="Normal"/>
         <w:numPr>
           <w:ilvl w:val="0"/>
-          <w:numId w:val="12"/>
+          <w:numId w:val="13"/>
         </w:numPr>
         <w:spacing w:before="0" w:after="0"/>
         <w:rPr/>
@@ -3947,7 +4385,7 @@
         <w:pStyle w:val="Normal"/>
         <w:numPr>
           <w:ilvl w:val="0"/>
-          <w:numId w:val="12"/>
+          <w:numId w:val="13"/>
         </w:numPr>
         <w:spacing w:before="0" w:after="0"/>
         <w:rPr/>
@@ -3962,7 +4400,7 @@
         <w:pStyle w:val="Normal"/>
         <w:numPr>
           <w:ilvl w:val="0"/>
-          <w:numId w:val="12"/>
+          <w:numId w:val="13"/>
         </w:numPr>
         <w:spacing w:before="0" w:after="0"/>
         <w:rPr/>
@@ -3977,7 +4415,7 @@
         <w:pStyle w:val="Normal"/>
         <w:numPr>
           <w:ilvl w:val="0"/>
-          <w:numId w:val="12"/>
+          <w:numId w:val="13"/>
         </w:numPr>
         <w:spacing w:before="0" w:after="0"/>
         <w:rPr/>
@@ -4268,7 +4706,7 @@
         <w:pStyle w:val="Normal"/>
         <w:numPr>
           <w:ilvl w:val="0"/>
-          <w:numId w:val="12"/>
+          <w:numId w:val="13"/>
         </w:numPr>
         <w:spacing w:before="0" w:after="0"/>
         <w:rPr/>
@@ -4283,7 +4721,7 @@
         <w:pStyle w:val="Normal"/>
         <w:numPr>
           <w:ilvl w:val="0"/>
-          <w:numId w:val="12"/>
+          <w:numId w:val="13"/>
         </w:numPr>
         <w:spacing w:before="0" w:after="0"/>
         <w:rPr/>
@@ -4302,7 +4740,7 @@
         <w:pStyle w:val="Normal"/>
         <w:numPr>
           <w:ilvl w:val="0"/>
-          <w:numId w:val="12"/>
+          <w:numId w:val="13"/>
         </w:numPr>
         <w:spacing w:before="0" w:after="0"/>
         <w:rPr/>
@@ -4357,7 +4795,7 @@
         <w:pStyle w:val="Normal"/>
         <w:numPr>
           <w:ilvl w:val="0"/>
-          <w:numId w:val="12"/>
+          <w:numId w:val="13"/>
         </w:numPr>
         <w:spacing w:before="0" w:after="0"/>
         <w:rPr/>
@@ -4372,7 +4810,7 @@
         <w:pStyle w:val="Normal"/>
         <w:numPr>
           <w:ilvl w:val="0"/>
-          <w:numId w:val="12"/>
+          <w:numId w:val="13"/>
         </w:numPr>
         <w:spacing w:before="0" w:after="0"/>
         <w:rPr/>
@@ -4387,7 +4825,7 @@
         <w:pStyle w:val="Normal"/>
         <w:numPr>
           <w:ilvl w:val="0"/>
-          <w:numId w:val="12"/>
+          <w:numId w:val="13"/>
         </w:numPr>
         <w:spacing w:before="0" w:after="0"/>
         <w:rPr/>
@@ -4402,7 +4840,7 @@
         <w:pStyle w:val="Normal"/>
         <w:numPr>
           <w:ilvl w:val="0"/>
-          <w:numId w:val="12"/>
+          <w:numId w:val="13"/>
         </w:numPr>
         <w:spacing w:before="0" w:after="0"/>
         <w:rPr/>
@@ -4440,8 +4878,8 @@
         <w:spacing w:before="0" w:after="0"/>
         <w:rPr/>
       </w:pPr>
-      <w:bookmarkStart w:id="21" w:name="__RefHeading___Toc761_3032948006"/>
-      <w:bookmarkEnd w:id="21"/>
+      <w:bookmarkStart w:id="22" w:name="__RefHeading___Toc761_3032948006"/>
+      <w:bookmarkEnd w:id="22"/>
       <w:r>
         <w:rPr/>
         <w:t>Article III(c) Interpretation</w:t>
@@ -4610,8 +5048,8 @@
         <w:spacing w:before="0" w:after="0"/>
         <w:rPr/>
       </w:pPr>
-      <w:bookmarkStart w:id="22" w:name="__RefHeading___Toc763_3032948006"/>
-      <w:bookmarkEnd w:id="22"/>
+      <w:bookmarkStart w:id="23" w:name="__RefHeading___Toc763_3032948006"/>
+      <w:bookmarkEnd w:id="23"/>
       <w:r>
         <w:rPr/>
         <w:t>Background – This is Complicated, Sorry</w:t>
@@ -5144,7 +5582,7 @@
         <w:pStyle w:val="Normal"/>
         <w:numPr>
           <w:ilvl w:val="0"/>
-          <w:numId w:val="3"/>
+          <w:numId w:val="4"/>
         </w:numPr>
         <w:spacing w:before="0" w:after="0"/>
         <w:rPr>
@@ -5166,7 +5604,7 @@
         <w:pStyle w:val="Normal"/>
         <w:numPr>
           <w:ilvl w:val="0"/>
-          <w:numId w:val="3"/>
+          <w:numId w:val="4"/>
         </w:numPr>
         <w:spacing w:before="0" w:after="0"/>
         <w:rPr>
@@ -5340,7 +5778,7 @@
             <v:imagedata r:id="rId20" o:title=""/>
             <w10:wrap type="square"/>
           </v:shape>
-          <o:OLEObject Type="Embed" ProgID="Excel.Sheet.12" ShapeID="ole_rId19" DrawAspect="Content" ObjectID="_957647982" r:id="rId19"/>
+          <o:OLEObject Type="Embed" ProgID="Excel.Sheet.12" ShapeID="ole_rId19" DrawAspect="Content" ObjectID="_465794567" r:id="rId19"/>
         </w:object>
       </w:r>
     </w:p>
@@ -5516,7 +5954,7 @@
         <w:pStyle w:val="Normal"/>
         <w:numPr>
           <w:ilvl w:val="0"/>
-          <w:numId w:val="12"/>
+          <w:numId w:val="13"/>
         </w:numPr>
         <w:spacing w:before="0" w:after="0"/>
         <w:rPr>
@@ -5538,7 +5976,7 @@
         <w:pStyle w:val="Normal"/>
         <w:numPr>
           <w:ilvl w:val="0"/>
-          <w:numId w:val="12"/>
+          <w:numId w:val="13"/>
         </w:numPr>
         <w:spacing w:before="0" w:after="0"/>
         <w:rPr>
@@ -5560,7 +5998,7 @@
         <w:pStyle w:val="Normal"/>
         <w:numPr>
           <w:ilvl w:val="0"/>
-          <w:numId w:val="12"/>
+          <w:numId w:val="13"/>
         </w:numPr>
         <w:spacing w:before="0" w:after="0"/>
         <w:rPr>
@@ -5582,7 +6020,7 @@
         <w:pStyle w:val="Normal"/>
         <w:numPr>
           <w:ilvl w:val="0"/>
-          <w:numId w:val="12"/>
+          <w:numId w:val="13"/>
         </w:numPr>
         <w:spacing w:before="0" w:after="0"/>
         <w:rPr>
@@ -5639,8 +6077,8 @@
         <w:pStyle w:val="Heading3"/>
         <w:rPr/>
       </w:pPr>
-      <w:bookmarkStart w:id="23" w:name="__RefHeading___Toc765_3032948006"/>
-      <w:bookmarkEnd w:id="23"/>
+      <w:bookmarkStart w:id="24" w:name="__RefHeading___Toc765_3032948006"/>
+      <w:bookmarkEnd w:id="24"/>
       <w:r>
         <w:rPr/>
         <w:t>Scenario 1 - Status Quo, 2007 Interim Guidelines</w:t>
@@ -5751,8 +6189,8 @@
         <w:pStyle w:val="Heading3"/>
         <w:rPr/>
       </w:pPr>
-      <w:bookmarkStart w:id="24" w:name="__RefHeading___Toc769_3032948006"/>
-      <w:bookmarkEnd w:id="24"/>
+      <w:bookmarkStart w:id="25" w:name="__RefHeading___Toc769_3032948006"/>
+      <w:bookmarkEnd w:id="25"/>
       <w:r>
         <w:rPr/>
         <w:t>Scenario 2 – Beneficial Consumptive Use Based</w:t>
@@ -5792,7 +6230,7 @@
         <w:pStyle w:val="Normal"/>
         <w:numPr>
           <w:ilvl w:val="0"/>
-          <w:numId w:val="5"/>
+          <w:numId w:val="6"/>
         </w:numPr>
         <w:spacing w:before="0" w:after="0"/>
         <w:rPr/>
@@ -5810,7 +6248,7 @@
         <w:pStyle w:val="Normal"/>
         <w:numPr>
           <w:ilvl w:val="0"/>
-          <w:numId w:val="5"/>
+          <w:numId w:val="6"/>
         </w:numPr>
         <w:spacing w:before="0" w:after="0"/>
         <w:rPr/>
@@ -5831,7 +6269,7 @@
         <w:pStyle w:val="Normal"/>
         <w:numPr>
           <w:ilvl w:val="0"/>
-          <w:numId w:val="5"/>
+          <w:numId w:val="6"/>
         </w:numPr>
         <w:spacing w:before="0" w:after="0"/>
         <w:rPr/>
@@ -5847,7 +6285,7 @@
         <w:pStyle w:val="Normal"/>
         <w:numPr>
           <w:ilvl w:val="0"/>
-          <w:numId w:val="5"/>
+          <w:numId w:val="6"/>
         </w:numPr>
         <w:spacing w:before="0" w:after="0"/>
         <w:rPr/>
@@ -5863,7 +6301,7 @@
         <w:pStyle w:val="Normal"/>
         <w:numPr>
           <w:ilvl w:val="0"/>
-          <w:numId w:val="5"/>
+          <w:numId w:val="6"/>
         </w:numPr>
         <w:spacing w:before="0" w:after="0"/>
         <w:rPr/>
@@ -5903,8 +6341,8 @@
         <w:pStyle w:val="Heading3"/>
         <w:rPr/>
       </w:pPr>
-      <w:bookmarkStart w:id="25" w:name="__RefHeading___Toc771_3032948006"/>
-      <w:bookmarkEnd w:id="25"/>
+      <w:bookmarkStart w:id="26" w:name="__RefHeading___Toc771_3032948006"/>
+      <w:bookmarkEnd w:id="26"/>
       <w:r>
         <w:rPr/>
         <w:t>Scenario 3 – Supply Based</w:t>
@@ -5943,7 +6381,7 @@
         <w:pStyle w:val="Normal"/>
         <w:numPr>
           <w:ilvl w:val="0"/>
-          <w:numId w:val="12"/>
+          <w:numId w:val="13"/>
         </w:numPr>
         <w:spacing w:before="0" w:after="0"/>
         <w:rPr/>
@@ -5958,7 +6396,7 @@
         <w:pStyle w:val="Normal"/>
         <w:numPr>
           <w:ilvl w:val="0"/>
-          <w:numId w:val="12"/>
+          <w:numId w:val="13"/>
         </w:numPr>
         <w:spacing w:before="0" w:after="0"/>
         <w:rPr/>
@@ -6047,7 +6485,7 @@
         <w:pStyle w:val="Normal"/>
         <w:numPr>
           <w:ilvl w:val="0"/>
-          <w:numId w:val="12"/>
+          <w:numId w:val="13"/>
         </w:numPr>
         <w:spacing w:before="0" w:after="0"/>
         <w:rPr/>
@@ -6062,7 +6500,7 @@
         <w:pStyle w:val="Normal"/>
         <w:numPr>
           <w:ilvl w:val="0"/>
-          <w:numId w:val="12"/>
+          <w:numId w:val="13"/>
         </w:numPr>
         <w:spacing w:before="0" w:after="0"/>
         <w:rPr/>
@@ -6077,7 +6515,7 @@
         <w:pStyle w:val="Normal"/>
         <w:numPr>
           <w:ilvl w:val="0"/>
-          <w:numId w:val="12"/>
+          <w:numId w:val="13"/>
         </w:numPr>
         <w:spacing w:before="0" w:after="0"/>
         <w:rPr/>
@@ -6158,7 +6596,7 @@
         <w:pStyle w:val="Normal"/>
         <w:numPr>
           <w:ilvl w:val="0"/>
-          <w:numId w:val="12"/>
+          <w:numId w:val="13"/>
         </w:numPr>
         <w:spacing w:before="0" w:after="0"/>
         <w:rPr/>
@@ -6173,7 +6611,7 @@
         <w:pStyle w:val="Normal"/>
         <w:numPr>
           <w:ilvl w:val="0"/>
-          <w:numId w:val="12"/>
+          <w:numId w:val="13"/>
         </w:numPr>
         <w:spacing w:before="0" w:after="0"/>
         <w:rPr/>
@@ -6188,7 +6626,7 @@
         <w:pStyle w:val="Normal"/>
         <w:numPr>
           <w:ilvl w:val="0"/>
-          <w:numId w:val="12"/>
+          <w:numId w:val="13"/>
         </w:numPr>
         <w:spacing w:before="0" w:after="0"/>
         <w:rPr/>
@@ -6218,8 +6656,8 @@
         <w:pStyle w:val="Heading2"/>
         <w:rPr/>
       </w:pPr>
-      <w:bookmarkStart w:id="26" w:name="__RefHeading___Toc773_3032948006"/>
-      <w:bookmarkEnd w:id="26"/>
+      <w:bookmarkStart w:id="27" w:name="__RefHeading___Toc773_3032948006"/>
+      <w:bookmarkEnd w:id="27"/>
       <w:r>
         <w:rPr/>
         <w:t>Article III(e) Interpretation</w:t>
@@ -6308,7 +6746,7 @@
         <w:pStyle w:val="Normal"/>
         <w:numPr>
           <w:ilvl w:val="0"/>
-          <w:numId w:val="12"/>
+          <w:numId w:val="13"/>
         </w:numPr>
         <w:spacing w:before="0" w:after="0"/>
         <w:rPr/>
@@ -6323,7 +6761,7 @@
         <w:pStyle w:val="Normal"/>
         <w:numPr>
           <w:ilvl w:val="0"/>
-          <w:numId w:val="12"/>
+          <w:numId w:val="13"/>
         </w:numPr>
         <w:spacing w:before="0" w:after="0"/>
         <w:rPr/>
@@ -6338,7 +6776,7 @@
         <w:pStyle w:val="Normal"/>
         <w:numPr>
           <w:ilvl w:val="0"/>
-          <w:numId w:val="12"/>
+          <w:numId w:val="13"/>
         </w:numPr>
         <w:spacing w:before="0" w:after="0"/>
         <w:rPr/>
@@ -6377,7 +6815,7 @@
         <w:pStyle w:val="Normal"/>
         <w:numPr>
           <w:ilvl w:val="0"/>
-          <w:numId w:val="12"/>
+          <w:numId w:val="13"/>
         </w:numPr>
         <w:spacing w:before="0" w:after="0"/>
         <w:rPr/>
@@ -6392,7 +6830,7 @@
         <w:pStyle w:val="Normal"/>
         <w:numPr>
           <w:ilvl w:val="0"/>
-          <w:numId w:val="12"/>
+          <w:numId w:val="13"/>
         </w:numPr>
         <w:spacing w:before="0" w:after="0"/>
         <w:rPr/>
@@ -6407,7 +6845,7 @@
         <w:pStyle w:val="Normal"/>
         <w:numPr>
           <w:ilvl w:val="0"/>
-          <w:numId w:val="12"/>
+          <w:numId w:val="13"/>
         </w:numPr>
         <w:spacing w:before="0" w:after="0"/>
         <w:rPr/>
@@ -6458,7 +6896,7 @@
         <w:pStyle w:val="Normal"/>
         <w:numPr>
           <w:ilvl w:val="0"/>
-          <w:numId w:val="12"/>
+          <w:numId w:val="13"/>
         </w:numPr>
         <w:spacing w:before="0" w:after="0"/>
         <w:rPr/>
@@ -6473,7 +6911,7 @@
         <w:pStyle w:val="Normal"/>
         <w:numPr>
           <w:ilvl w:val="0"/>
-          <w:numId w:val="12"/>
+          <w:numId w:val="13"/>
         </w:numPr>
         <w:spacing w:before="0" w:after="0"/>
         <w:rPr/>
@@ -6488,7 +6926,7 @@
         <w:pStyle w:val="Normal"/>
         <w:numPr>
           <w:ilvl w:val="0"/>
-          <w:numId w:val="12"/>
+          <w:numId w:val="13"/>
         </w:numPr>
         <w:spacing w:before="0" w:after="0"/>
         <w:rPr/>
@@ -6597,7 +7035,7 @@
         <w:pStyle w:val="Normal"/>
         <w:numPr>
           <w:ilvl w:val="0"/>
-          <w:numId w:val="1"/>
+          <w:numId w:val="2"/>
         </w:numPr>
         <w:rPr/>
       </w:pPr>
@@ -6614,7 +7052,7 @@
         <w:pStyle w:val="Normal"/>
         <w:numPr>
           <w:ilvl w:val="0"/>
-          <w:numId w:val="1"/>
+          <w:numId w:val="2"/>
         </w:numPr>
         <w:rPr/>
       </w:pPr>
@@ -6631,7 +7069,7 @@
         <w:pStyle w:val="Normal"/>
         <w:numPr>
           <w:ilvl w:val="0"/>
-          <w:numId w:val="1"/>
+          <w:numId w:val="2"/>
         </w:numPr>
         <w:rPr/>
       </w:pPr>
@@ -6662,7 +7100,7 @@
         <w:pStyle w:val="Normal"/>
         <w:numPr>
           <w:ilvl w:val="0"/>
-          <w:numId w:val="1"/>
+          <w:numId w:val="2"/>
         </w:numPr>
         <w:rPr/>
       </w:pPr>
@@ -6694,7 +7132,7 @@
         <w:pStyle w:val="Normal"/>
         <w:numPr>
           <w:ilvl w:val="0"/>
-          <w:numId w:val="1"/>
+          <w:numId w:val="2"/>
         </w:numPr>
         <w:rPr/>
       </w:pPr>
@@ -6725,7 +7163,7 @@
         <w:pStyle w:val="Normal"/>
         <w:numPr>
           <w:ilvl w:val="0"/>
-          <w:numId w:val="1"/>
+          <w:numId w:val="2"/>
         </w:numPr>
         <w:rPr/>
       </w:pPr>
@@ -6756,7 +7194,7 @@
         <w:pStyle w:val="Normal"/>
         <w:numPr>
           <w:ilvl w:val="0"/>
-          <w:numId w:val="1"/>
+          <w:numId w:val="2"/>
         </w:numPr>
         <w:rPr/>
       </w:pPr>
@@ -6800,7 +7238,7 @@
         <w:pStyle w:val="Normal"/>
         <w:numPr>
           <w:ilvl w:val="0"/>
-          <w:numId w:val="1"/>
+          <w:numId w:val="2"/>
         </w:numPr>
         <w:rPr/>
       </w:pPr>
@@ -6817,7 +7255,7 @@
         <w:pStyle w:val="Normal"/>
         <w:numPr>
           <w:ilvl w:val="0"/>
-          <w:numId w:val="1"/>
+          <w:numId w:val="2"/>
         </w:numPr>
         <w:rPr/>
       </w:pPr>
@@ -6836,7 +7274,7 @@
         <w:pStyle w:val="Normal"/>
         <w:numPr>
           <w:ilvl w:val="0"/>
-          <w:numId w:val="1"/>
+          <w:numId w:val="2"/>
         </w:numPr>
         <w:rPr/>
       </w:pPr>
@@ -6853,7 +7291,7 @@
         <w:pStyle w:val="Normal"/>
         <w:numPr>
           <w:ilvl w:val="0"/>
-          <w:numId w:val="1"/>
+          <w:numId w:val="2"/>
         </w:numPr>
         <w:rPr/>
       </w:pPr>
@@ -6874,7 +7312,7 @@
         <w:pStyle w:val="Normal"/>
         <w:numPr>
           <w:ilvl w:val="0"/>
-          <w:numId w:val="1"/>
+          <w:numId w:val="2"/>
         </w:numPr>
         <w:rPr/>
       </w:pPr>
@@ -6884,231 +7322,6 @@
           <w:bCs w:val="false"/>
         </w:rPr>
         <w:t>MWD interstate for SNWA: Cumulative 330,225 AF stored in California aquifers through 2024 (no new storage in recent years; stable balance).</w:t>
-      </w:r>
-    </w:p>
-    <w:p>
-      <w:pPr>
-        <w:pStyle w:val="Normal"/>
-        <w:numPr>
-          <w:ilvl w:val="0"/>
-          <w:numId w:val="1"/>
-        </w:numPr>
-        <w:rPr/>
-      </w:pPr>
-      <w:r>
-        <w:rPr>
-          <w:b w:val="false"/>
-          <w:bCs w:val="false"/>
-        </w:rPr>
-        <w:t>CVWD conjunctive use/replenishment (Coachella Valley aquifers, including Colorado River sources via CRA exchanges): Cumulative over ~4.37 million AF from 1973–2023 across facilities (mix of SWP and Colorado River; ~4.14 million AF to Whitewater River facility alone). Recent annual replenishment (including Colorado River portions):</w:t>
-      </w:r>
-    </w:p>
-    <w:p>
-      <w:pPr>
-        <w:pStyle w:val="Normal"/>
-        <w:numPr>
-          <w:ilvl w:val="0"/>
-          <w:numId w:val="1"/>
-        </w:numPr>
-        <w:rPr/>
-      </w:pPr>
-      <w:r>
-        <w:rPr>
-          <w:b w:val="false"/>
-          <w:bCs w:val="false"/>
-        </w:rPr>
-        <w:t>2023: ~320,962 AF total artificial replenishment (significant portion Colorado River-related).</w:t>
-      </w:r>
-    </w:p>
-    <w:p>
-      <w:pPr>
-        <w:pStyle w:val="Normal"/>
-        <w:numPr>
-          <w:ilvl w:val="0"/>
-          <w:numId w:val="1"/>
-        </w:numPr>
-        <w:rPr/>
-      </w:pPr>
-      <w:r>
-        <w:rPr>
-          <w:b w:val="false"/>
-          <w:bCs w:val="false"/>
-        </w:rPr>
-        <w:t>2023–2024 water year: ~296,726 AF imported/local surface water recharged in Indio Subbasin (with managed recharge reduced in some facilities due to voluntary Colorado River conservation).</w:t>
-      </w:r>
-    </w:p>
-    <w:p>
-      <w:pPr>
-        <w:pStyle w:val="Normal"/>
-        <w:numPr>
-          <w:ilvl w:val="0"/>
-          <w:numId w:val="1"/>
-        </w:numPr>
-        <w:rPr/>
-      </w:pPr>
-      <w:r>
-        <w:rPr>
-          <w:b w:val="false"/>
-          <w:bCs w:val="false"/>
-        </w:rPr>
-        <w:t>Earlier periods: Over 2 million AF in first 35 years (1973–~2008); ongoing but variable with availability. These are not structured as formal LTSCs but support long-term aquifer storage offsetting pumping.</w:t>
-      </w:r>
-    </w:p>
-    <w:p>
-      <w:pPr>
-        <w:pStyle w:val="Heading3"/>
-        <w:rPr/>
-      </w:pPr>
-      <w:bookmarkStart w:id="27" w:name="__RefHeading___Toc5795_4147804815"/>
-      <w:bookmarkEnd w:id="27"/>
-      <w:r>
-        <w:rPr/>
-        <w:br/>
-        <w:t>Lower Basin Aquifer Storage Summary</w:t>
-      </w:r>
-    </w:p>
-    <w:p>
-      <w:pPr>
-        <w:pStyle w:val="Normal"/>
-        <w:numPr>
-          <w:ilvl w:val="0"/>
-          <w:numId w:val="1"/>
-        </w:numPr>
-        <w:rPr/>
-      </w:pPr>
-      <w:r>
-        <w:rPr>
-          <w:b w:val="false"/>
-          <w:bCs w:val="false"/>
-        </w:rPr>
-        <w:t>Grand cumulative aquifer storage of Colorado River water (all programs, approximate end-2024):</w:t>
-      </w:r>
-      <w:r>
-        <w:rPr>
-          <w:b/>
-          <w:bCs/>
-        </w:rPr>
-        <w:t xml:space="preserve"> &gt;9 million AF (AWBA ~4.41 million AF + CVWD &gt;4 million AF + SNWA local ~0.34 million AF </w:t>
-      </w:r>
-      <w:r>
-        <w:rPr>
-          <w:b w:val="false"/>
-          <w:bCs w:val="false"/>
-        </w:rPr>
-        <w:t>+ other minor; with overlaps in interstate credits not double-counted as new transfers).</w:t>
-      </w:r>
-    </w:p>
-    <w:p>
-      <w:pPr>
-        <w:pStyle w:val="Normal"/>
-        <w:numPr>
-          <w:ilvl w:val="0"/>
-          <w:numId w:val="1"/>
-        </w:numPr>
-        <w:rPr/>
-      </w:pPr>
-      <w:r>
-        <w:rPr>
-          <w:b w:val="false"/>
-          <w:bCs w:val="false"/>
-        </w:rPr>
-        <w:t xml:space="preserve">Interstate for Nevada benefit (stable benchmark): </w:t>
-      </w:r>
-      <w:r>
-        <w:rPr>
-          <w:b/>
-          <w:bCs/>
-        </w:rPr>
-        <w:t>944,071 AF.</w:t>
-      </w:r>
-    </w:p>
-    <w:p>
-      <w:pPr>
-        <w:pStyle w:val="Normal"/>
-        <w:numPr>
-          <w:ilvl w:val="0"/>
-          <w:numId w:val="1"/>
-        </w:numPr>
-        <w:rPr/>
-      </w:pPr>
-      <w:r>
-        <w:rPr>
-          <w:b w:val="false"/>
-          <w:bCs w:val="false"/>
-        </w:rPr>
-        <w:t>Due to the shift from new physical storage to credit purchases, conservation, and ICS, no comprehensive annual additions table exists for recent years.</w:t>
-      </w:r>
-    </w:p>
-    <w:p>
-      <w:pPr>
-        <w:pStyle w:val="Heading2"/>
-        <w:rPr>
-          <w:b/>
-          <w:b/>
-          <w:bCs/>
-        </w:rPr>
-      </w:pPr>
-      <w:bookmarkStart w:id="28" w:name="__RefHeading___Toc5831_4147804815"/>
-      <w:bookmarkEnd w:id="28"/>
-      <w:r>
-        <w:rPr/>
-        <w:t>Canonical Legal Arguments Related to Operational Questions</w:t>
-      </w:r>
-    </w:p>
-    <w:p>
-      <w:pPr>
-        <w:pStyle w:val="Normal"/>
-        <w:rPr>
-          <w:b/>
-          <w:b/>
-          <w:bCs/>
-        </w:rPr>
-      </w:pPr>
-      <w:r>
-        <w:rPr/>
-        <w:t>Hopefully you didn’t make it this far.  We are hoping the Seven States don’t either.  The following are fairly canonical Upper Basin arguments you may see in event of a Lower Basin Compact Call or litigation.  We don’t want to go here, but we will if we have to.  School yard bully rule applies.  In that event we will apply additional resources to develop these and apply some of our unconventional wisdom to strengthen them.</w:t>
-      </w:r>
-    </w:p>
-    <w:p>
-      <w:pPr>
-        <w:pStyle w:val="Normal"/>
-        <w:rPr>
-          <w:b/>
-          <w:b/>
-          <w:bCs/>
-        </w:rPr>
-      </w:pPr>
-      <w:r>
-        <w:rPr/>
-        <w:t>These will obviously have direct impact impact on USBR operation of the system if these events occur so are relevant to the EIS process.</w:t>
-      </w:r>
-    </w:p>
-    <w:p>
-      <w:pPr>
-        <w:pStyle w:val="Heading3"/>
-        <w:rPr/>
-      </w:pPr>
-      <w:bookmarkStart w:id="29" w:name="__RefHeading___Toc6516_4147804815"/>
-      <w:bookmarkEnd w:id="29"/>
-      <w:r>
-        <w:rPr/>
-        <w:t>Article III(d)</w:t>
-      </w:r>
-    </w:p>
-    <w:p>
-      <w:pPr>
-        <w:pStyle w:val="Normal"/>
-        <w:rPr>
-          <w:rFonts w:ascii="Liberation Sans" w:hAnsi="Liberation Sans"/>
-        </w:rPr>
-      </w:pPr>
-      <w:r>
-        <w:rPr>
-          <w:rFonts w:ascii="Liberation Sans" w:hAnsi="Liberation Sans"/>
-          <w:color w:val="000000"/>
-          <w:shd w:fill="auto" w:val="clear"/>
-        </w:rPr>
-        <w:t>The canonical Upper Basin position on the core dispute in the Colorado River Compact of 1922 (particularly Article III(d)) centers on interpreting the Upper Division states' (Colorado, New Mexico, Utah, Wyoming) obligation as a "non-depletion" duty rather than a strict delivery guarantee to the Lower Basin (Arizona, California, Nevada).Article III(d) states: the Upper Division states "will not cause the flow of the river at Lee Ferry to be depleted below an aggregate of 75,000,000 acre-feet for any period of ten consecutive years." The Upper Basin interprets this literally as a prohibition on their own actions causing depletion—meaning they must not consume (deplete) more than their share in a way that drops the 10-year rolling flow at Lee Ferry (just below Glen Canyon Dam) below 75 million acre-feet (MAF), averaging 7.5 MAF/year.Key elements of the Upper Basin view:</w:t>
       </w:r>
     </w:p>
     <w:p>
@@ -7122,11 +7335,10 @@
       </w:pPr>
       <w:r>
         <w:rPr>
-          <w:rFonts w:ascii="Liberation Sans" w:hAnsi="Liberation Sans"/>
-          <w:color w:val="000000"/>
-          <w:shd w:fill="auto" w:val="clear"/>
-        </w:rPr>
-        <w:t>No absolute delivery obligation — They are not required to guarantee or "deliver" 7.5 MAF annually (or 75 MAF/10 years) to the Lower Basin regardless of natural conditions. If low runoff from climate change, drought, or aridity reduces natural flows, the Upper Basin is not at fault and should not face forced cuts solely to meet a fixed delivery target.</w:t>
+          <w:b w:val="false"/>
+          <w:bCs w:val="false"/>
+        </w:rPr>
+        <w:t>CVWD conjunctive use/replenishment (Coachella Valley aquifers, including Colorado River sources via CRA exchanges): Cumulative over ~4.37 million AF from 1973–2023 across facilities (mix of SWP and Colorado River; ~4.14 million AF to Whitewater River facility alone). Recent annual replenishment (including Colorado River portions):</w:t>
       </w:r>
     </w:p>
     <w:p>
@@ -7140,11 +7352,10 @@
       </w:pPr>
       <w:r>
         <w:rPr>
-          <w:rFonts w:ascii="Liberation Sans" w:hAnsi="Liberation Sans"/>
-          <w:color w:val="000000"/>
-          <w:shd w:fill="auto" w:val="clear"/>
-        </w:rPr>
-        <w:t>Consumptive use cap — Their primary limit is their own beneficial consumptive use (up to 7.5 MAF/year basin-wide under Article III(a)), plus their share of U.S. treaty water to Mexico if no surplus exists (Article III(c)). They argue they have never fully used their 7.5 MAF allocation (often ~4–5 MAF in recent decades), so any shortfall at Lee Ferry stems from reduced supply, not overuse.</w:t>
+          <w:b w:val="false"/>
+          <w:bCs w:val="false"/>
+        </w:rPr>
+        <w:t>2023: ~320,962 AF total artificial replenishment (significant portion Colorado River-related).</w:t>
       </w:r>
     </w:p>
     <w:p>
@@ -7158,11 +7369,10 @@
       </w:pPr>
       <w:r>
         <w:rPr>
-          <w:rFonts w:ascii="Liberation Sans" w:hAnsi="Liberation Sans"/>
-          <w:color w:val="000000"/>
-          <w:shd w:fill="auto" w:val="clear"/>
-        </w:rPr>
-        <w:t>Climate change as force majeure — Depletion caused by natural variability or long-term aridification (not human depletions in the Upper Basin) does not trigger a Compact violation or "call" requiring Upper Basin curtailments. This protects upstream development rights, as the Compact was designed to allow Upper Basin growth without being penalized by prior Lower Basin claims.</w:t>
+          <w:b w:val="false"/>
+          <w:bCs w:val="false"/>
+        </w:rPr>
+        <w:t>2023–2024 water year: ~296,726 AF imported/local surface water recharged in Indio Subbasin (with managed recharge reduced in some facilities due to voluntary Colorado River conservation).</w:t>
       </w:r>
     </w:p>
     <w:p>
@@ -7176,22 +7386,195 @@
       </w:pPr>
       <w:r>
         <w:rPr>
+          <w:b w:val="false"/>
+          <w:bCs w:val="false"/>
+        </w:rPr>
+        <w:t>Earlier periods: Over 2 million AF in first 35 years (1973–~2008); ongoing but variable with availability. These are not structured as formal LTSCs but support long-term aquifer storage offsetting pumping.</w:t>
+      </w:r>
+    </w:p>
+    <w:p>
+      <w:pPr>
+        <w:pStyle w:val="Heading3"/>
+        <w:rPr/>
+      </w:pPr>
+      <w:bookmarkStart w:id="28" w:name="__RefHeading___Toc5795_4147804815"/>
+      <w:bookmarkEnd w:id="28"/>
+      <w:r>
+        <w:rPr/>
+        <w:br/>
+        <w:t>Lower Basin Aquifer Storage Summary</w:t>
+      </w:r>
+    </w:p>
+    <w:p>
+      <w:pPr>
+        <w:pStyle w:val="Normal"/>
+        <w:numPr>
+          <w:ilvl w:val="0"/>
+          <w:numId w:val="2"/>
+        </w:numPr>
+        <w:rPr/>
+      </w:pPr>
+      <w:r>
+        <w:rPr>
+          <w:b w:val="false"/>
+          <w:bCs w:val="false"/>
+        </w:rPr>
+        <w:t>Grand cumulative aquifer storage of Colorado River water (all programs, approximate end-2024):</w:t>
+      </w:r>
+      <w:r>
+        <w:rPr>
+          <w:b/>
+          <w:bCs/>
+        </w:rPr>
+        <w:t xml:space="preserve"> &gt;9 million AF (AWBA ~4.41 million AF + CVWD &gt;4 million AF + SNWA local ~0.34 million AF </w:t>
+      </w:r>
+      <w:r>
+        <w:rPr>
+          <w:b w:val="false"/>
+          <w:bCs w:val="false"/>
+        </w:rPr>
+        <w:t>+ other minor; with overlaps in interstate credits not double-counted as new transfers).</w:t>
+      </w:r>
+    </w:p>
+    <w:p>
+      <w:pPr>
+        <w:pStyle w:val="Normal"/>
+        <w:numPr>
+          <w:ilvl w:val="0"/>
+          <w:numId w:val="2"/>
+        </w:numPr>
+        <w:rPr/>
+      </w:pPr>
+      <w:r>
+        <w:rPr>
+          <w:b w:val="false"/>
+          <w:bCs w:val="false"/>
+        </w:rPr>
+        <w:t xml:space="preserve">Interstate for Nevada benefit (stable benchmark): </w:t>
+      </w:r>
+      <w:r>
+        <w:rPr>
+          <w:b/>
+          <w:bCs/>
+        </w:rPr>
+        <w:t>944,071 AF.</w:t>
+      </w:r>
+    </w:p>
+    <w:p>
+      <w:pPr>
+        <w:pStyle w:val="Normal"/>
+        <w:numPr>
+          <w:ilvl w:val="0"/>
+          <w:numId w:val="2"/>
+        </w:numPr>
+        <w:rPr/>
+      </w:pPr>
+      <w:r>
+        <w:rPr>
+          <w:b w:val="false"/>
+          <w:bCs w:val="false"/>
+        </w:rPr>
+        <w:t>Due to the shift from new physical storage to credit purchases, conservation, and ICS, no comprehensive annual additions table exists for recent years.</w:t>
+      </w:r>
+    </w:p>
+    <w:p>
+      <w:pPr>
+        <w:pStyle w:val="Heading2"/>
+        <w:rPr>
+          <w:b/>
+          <w:b/>
+          <w:bCs/>
+        </w:rPr>
+      </w:pPr>
+      <w:bookmarkStart w:id="29" w:name="__RefHeading___Toc5831_4147804815"/>
+      <w:bookmarkEnd w:id="29"/>
+      <w:r>
+        <w:rPr/>
+        <w:t>Canonical Legal Arguments Related to Operational Questions</w:t>
+      </w:r>
+    </w:p>
+    <w:p>
+      <w:pPr>
+        <w:pStyle w:val="Normal"/>
+        <w:rPr>
+          <w:b/>
+          <w:b/>
+          <w:bCs/>
+        </w:rPr>
+      </w:pPr>
+      <w:r>
+        <w:rPr/>
+        <w:t>Hopefully you didn’t make it this far.  We are hoping the Seven States don’t either.  The following are fairly canonical Upper Basin arguments you may see in event of a Lower Basin Compact Call or litigation.  We don’t want to go here, but we will if we have to.  School yard bully rule applies.  In that event we will apply additional resources to develop these and apply some of our unconventional wisdom to strengthen them.</w:t>
+      </w:r>
+    </w:p>
+    <w:p>
+      <w:pPr>
+        <w:pStyle w:val="Normal"/>
+        <w:rPr>
+          <w:b/>
+          <w:b/>
+          <w:bCs/>
+        </w:rPr>
+      </w:pPr>
+      <w:r>
+        <w:rPr/>
+        <w:t>These will obviously have direct impact impact on USBR operation of the system if these events occur so are relevant to the EIS process.</w:t>
+      </w:r>
+    </w:p>
+    <w:p>
+      <w:pPr>
+        <w:pStyle w:val="Heading3"/>
+        <w:rPr/>
+      </w:pPr>
+      <w:bookmarkStart w:id="30" w:name="__RefHeading___Toc6516_4147804815"/>
+      <w:bookmarkEnd w:id="30"/>
+      <w:r>
+        <w:rPr/>
+        <w:t>Article III(d)</w:t>
+      </w:r>
+    </w:p>
+    <w:p>
+      <w:pPr>
+        <w:pStyle w:val="Normal"/>
+        <w:rPr>
+          <w:rFonts w:ascii="Liberation Sans" w:hAnsi="Liberation Sans"/>
+        </w:rPr>
+      </w:pPr>
+      <w:r>
+        <w:rPr>
           <w:rFonts w:ascii="Liberation Sans" w:hAnsi="Liberation Sans"/>
           <w:color w:val="000000"/>
           <w:shd w:fill="auto" w:val="clear"/>
         </w:rPr>
-        <w:t>Contrast with Lower Basin view — Lower Basin states read III(d) as imposing a firm delivery requirement (strict liability for 75 MAF/10 years at Lee Ferry, potentially including half of Mexico's share under operating criteria), enforceable via litigation if flows fall short.</w:t>
-      </w:r>
-    </w:p>
-    <w:p>
-      <w:pPr>
-        <w:pStyle w:val="TextBody"/>
-        <w:spacing w:before="0" w:after="0"/>
+        <w:t>The canonical Upper Basin position on the core dispute in the Colorado River Compact of 1922 (particularly Article III(d)) centers on interpreting the Upper Division states' (Colorado, New Mexico, Utah, Wyoming) obligation as a "non-depletion" duty rather than a strict delivery guarantee to the Lower Basin (Arizona, California, Nevada).Article III(d) states: the Upper Division states "will not cause the flow of the river at Lee Ferry to be depleted below an aggregate of 75,000,000 acre-feet for any period of ten consecutive years." The Upper Basin interprets this literally as a prohibition on their own actions causing depletion—meaning they must not consume (deplete) more than their share in a way that drops the 10-year rolling flow at Lee Ferry (just below Glen Canyon Dam) below 75 million acre-feet (MAF), averaging 7.5 MAF/year.Key elements of the Upper Basin view:</w:t>
+      </w:r>
+    </w:p>
+    <w:p>
+      <w:pPr>
+        <w:pStyle w:val="Normal"/>
+        <w:numPr>
+          <w:ilvl w:val="0"/>
+          <w:numId w:val="3"/>
+        </w:numPr>
+        <w:rPr/>
+      </w:pPr>
+      <w:r>
         <w:rPr>
           <w:rFonts w:ascii="Liberation Sans" w:hAnsi="Liberation Sans"/>
           <w:color w:val="000000"/>
           <w:shd w:fill="auto" w:val="clear"/>
         </w:rPr>
+        <w:t>No absolute delivery obligation — They are not required to guarantee or "deliver" 7.5 MAF annually (or 75 MAF/10 years) to the Lower Basin regardless of natural conditions. If low runoff from climate change, drought, or aridity reduces natural flows, the Upper Basin is not at fault and should not face forced cuts solely to meet a fixed delivery target.</w:t>
+      </w:r>
+    </w:p>
+    <w:p>
+      <w:pPr>
+        <w:pStyle w:val="Normal"/>
+        <w:numPr>
+          <w:ilvl w:val="0"/>
+          <w:numId w:val="3"/>
+        </w:numPr>
+        <w:rPr/>
       </w:pPr>
       <w:r>
         <w:rPr>
@@ -7199,6 +7582,61 @@
           <w:color w:val="000000"/>
           <w:shd w:fill="auto" w:val="clear"/>
         </w:rPr>
+        <w:t>Consumptive use cap — Their primary limit is their own beneficial consumptive use (up to 7.5 MAF/year basin-wide under Article III(a)), plus their share of U.S. treaty water to Mexico if no surplus exists (Article III(c)). They argue they have never fully used their 7.5 MAF allocation (often ~4–5 MAF in recent decades), so any shortfall at Lee Ferry stems from reduced supply, not overuse.</w:t>
+      </w:r>
+    </w:p>
+    <w:p>
+      <w:pPr>
+        <w:pStyle w:val="Normal"/>
+        <w:numPr>
+          <w:ilvl w:val="0"/>
+          <w:numId w:val="3"/>
+        </w:numPr>
+        <w:rPr/>
+      </w:pPr>
+      <w:r>
+        <w:rPr>
+          <w:rFonts w:ascii="Liberation Sans" w:hAnsi="Liberation Sans"/>
+          <w:color w:val="000000"/>
+          <w:shd w:fill="auto" w:val="clear"/>
+        </w:rPr>
+        <w:t>Climate change as force majeure — Depletion caused by natural variability or long-term aridification (not human depletions in the Upper Basin) does not trigger a Compact violation or "call" requiring Upper Basin curtailments. This protects upstream development rights, as the Compact was designed to allow Upper Basin growth without being penalized by prior Lower Basin claims.</w:t>
+      </w:r>
+    </w:p>
+    <w:p>
+      <w:pPr>
+        <w:pStyle w:val="Normal"/>
+        <w:numPr>
+          <w:ilvl w:val="0"/>
+          <w:numId w:val="3"/>
+        </w:numPr>
+        <w:rPr/>
+      </w:pPr>
+      <w:r>
+        <w:rPr>
+          <w:rFonts w:ascii="Liberation Sans" w:hAnsi="Liberation Sans"/>
+          <w:color w:val="000000"/>
+          <w:shd w:fill="auto" w:val="clear"/>
+        </w:rPr>
+        <w:t>Contrast with Lower Basin view — Lower Basin states read III(d) as imposing a firm delivery requirement (strict liability for 75 MAF/10 years at Lee Ferry, potentially including half of Mexico's share under operating criteria), enforceable via litigation if flows fall short.</w:t>
+      </w:r>
+    </w:p>
+    <w:p>
+      <w:pPr>
+        <w:pStyle w:val="TextBody"/>
+        <w:spacing w:before="0" w:after="0"/>
+        <w:rPr>
+          <w:rFonts w:ascii="Liberation Sans" w:hAnsi="Liberation Sans"/>
+          <w:color w:val="000000"/>
+          <w:shd w:fill="auto" w:val="clear"/>
+        </w:rPr>
+      </w:pPr>
+      <w:r>
+        <w:rPr>
+          <w:rFonts w:ascii="Liberation Sans" w:hAnsi="Liberation Sans"/>
+          <w:color w:val="000000"/>
+          <w:shd w:fill="auto" w:val="clear"/>
+        </w:rPr>
         <w:t>This interpretation aligns with the Compact's 1922 context: Upper Basin delegates feared Lower Basin storage projects (like Hoover Dam) could establish prior rights before upstream states developed, so they insisted on "non-depletion" language to safeguard future use. The Upper Basin Compact (1948) reinforces this by allocating percentages of available water after meeting Compact obligations, without mandating fixed deliveries. In modern negotiations (post-2026 guidelines), this stance emphasizes shared basin-wide responsibility for shortages driven by climate, not unilateral Upper Basin cuts, while rejecting litigation threats of a "Compact call."</w:t>
       </w:r>
     </w:p>
@@ -7251,8 +7689,8 @@
           <w:bCs/>
         </w:rPr>
       </w:pPr>
-      <w:bookmarkStart w:id="30" w:name="__RefHeading___Toc5773_4147804815"/>
-      <w:bookmarkEnd w:id="30"/>
+      <w:bookmarkStart w:id="31" w:name="__RefHeading___Toc5773_4147804815"/>
+      <w:bookmarkEnd w:id="31"/>
       <w:r>
         <w:rPr/>
         <w:t>Article III(b)</w:t>
@@ -7339,7 +7777,7 @@
         <w:pStyle w:val="Normal"/>
         <w:numPr>
           <w:ilvl w:val="0"/>
-          <w:numId w:val="4"/>
+          <w:numId w:val="5"/>
         </w:numPr>
         <w:rPr/>
       </w:pPr>
@@ -7357,7 +7795,7 @@
         <w:pStyle w:val="Normal"/>
         <w:numPr>
           <w:ilvl w:val="0"/>
-          <w:numId w:val="4"/>
+          <w:numId w:val="5"/>
         </w:numPr>
         <w:rPr/>
       </w:pPr>
@@ -7375,7 +7813,7 @@
         <w:pStyle w:val="Normal"/>
         <w:numPr>
           <w:ilvl w:val="0"/>
-          <w:numId w:val="4"/>
+          <w:numId w:val="5"/>
         </w:numPr>
         <w:rPr/>
       </w:pPr>
@@ -7393,7 +7831,7 @@
         <w:pStyle w:val="Normal"/>
         <w:numPr>
           <w:ilvl w:val="0"/>
-          <w:numId w:val="4"/>
+          <w:numId w:val="5"/>
         </w:numPr>
         <w:rPr/>
       </w:pPr>
@@ -7430,8 +7868,8 @@
         <w:pStyle w:val="Heading3"/>
         <w:rPr/>
       </w:pPr>
-      <w:bookmarkStart w:id="31" w:name="__RefHeading___Toc2842_3032948006"/>
-      <w:bookmarkEnd w:id="31"/>
+      <w:bookmarkStart w:id="32" w:name="__RefHeading___Toc2842_3032948006"/>
+      <w:bookmarkEnd w:id="32"/>
       <w:r>
         <w:rPr/>
         <w:t>Gila River</w:t>
@@ -7544,8 +7982,8 @@
           <w:bCs/>
         </w:rPr>
       </w:pPr>
-      <w:bookmarkStart w:id="32" w:name="__RefHeading___Toc5797_4147804815"/>
-      <w:bookmarkEnd w:id="32"/>
+      <w:bookmarkStart w:id="33" w:name="__RefHeading___Toc5797_4147804815"/>
+      <w:bookmarkEnd w:id="33"/>
       <w:r>
         <w:rPr>
           <w:b/>
@@ -7566,7 +8004,7 @@
         <w:pStyle w:val="TextBody"/>
         <w:numPr>
           <w:ilvl w:val="0"/>
-          <w:numId w:val="13"/>
+          <w:numId w:val="14"/>
         </w:numPr>
         <w:tabs>
           <w:tab w:val="clear" w:pos="720"/>
@@ -7597,7 +8035,7 @@
         <w:pStyle w:val="TextBody"/>
         <w:numPr>
           <w:ilvl w:val="0"/>
-          <w:numId w:val="13"/>
+          <w:numId w:val="14"/>
         </w:numPr>
         <w:tabs>
           <w:tab w:val="clear" w:pos="720"/>
@@ -7628,7 +8066,7 @@
         <w:pStyle w:val="TextBody"/>
         <w:numPr>
           <w:ilvl w:val="0"/>
-          <w:numId w:val="13"/>
+          <w:numId w:val="14"/>
         </w:numPr>
         <w:tabs>
           <w:tab w:val="clear" w:pos="720"/>
@@ -7659,7 +8097,7 @@
         <w:pStyle w:val="TextBody"/>
         <w:numPr>
           <w:ilvl w:val="0"/>
-          <w:numId w:val="13"/>
+          <w:numId w:val="14"/>
         </w:numPr>
         <w:tabs>
           <w:tab w:val="clear" w:pos="720"/>
@@ -7778,7 +8216,7 @@
     </w:r>
     <w:r>
       <w:rPr/>
-      <w:t>42</w:t>
+      <w:t>45</w:t>
     </w:r>
     <w:r>
       <w:rPr/>
@@ -8341,6 +8779,143 @@
   <w:abstractNum w:abstractNumId="5">
     <w:lvl w:ilvl="0">
       <w:start w:val="1"/>
+      <w:numFmt w:val="bullet"/>
+      <w:lvlText w:val=""/>
+      <w:lvlJc w:val="left"/>
+      <w:pPr>
+        <w:tabs>
+          <w:tab w:val="num" w:pos="227"/>
+        </w:tabs>
+        <w:ind w:left="227" w:hanging="227"/>
+      </w:pPr>
+      <w:rPr>
+        <w:rFonts w:ascii="Symbol" w:hAnsi="Symbol" w:cs="Symbol" w:hint="default"/>
+      </w:rPr>
+    </w:lvl>
+    <w:lvl w:ilvl="1">
+      <w:start w:val="1"/>
+      <w:numFmt w:val="bullet"/>
+      <w:lvlText w:val=""/>
+      <w:lvlJc w:val="left"/>
+      <w:pPr>
+        <w:tabs>
+          <w:tab w:val="num" w:pos="454"/>
+        </w:tabs>
+        <w:ind w:left="454" w:hanging="227"/>
+      </w:pPr>
+      <w:rPr>
+        <w:rFonts w:ascii="Symbol" w:hAnsi="Symbol" w:cs="Symbol" w:hint="default"/>
+      </w:rPr>
+    </w:lvl>
+    <w:lvl w:ilvl="2">
+      <w:start w:val="1"/>
+      <w:numFmt w:val="bullet"/>
+      <w:lvlText w:val=""/>
+      <w:lvlJc w:val="left"/>
+      <w:pPr>
+        <w:tabs>
+          <w:tab w:val="num" w:pos="680"/>
+        </w:tabs>
+        <w:ind w:left="680" w:hanging="227"/>
+      </w:pPr>
+      <w:rPr>
+        <w:rFonts w:ascii="Symbol" w:hAnsi="Symbol" w:cs="Symbol" w:hint="default"/>
+      </w:rPr>
+    </w:lvl>
+    <w:lvl w:ilvl="3">
+      <w:start w:val="1"/>
+      <w:numFmt w:val="bullet"/>
+      <w:lvlText w:val=""/>
+      <w:lvlJc w:val="left"/>
+      <w:pPr>
+        <w:tabs>
+          <w:tab w:val="num" w:pos="907"/>
+        </w:tabs>
+        <w:ind w:left="907" w:hanging="227"/>
+      </w:pPr>
+      <w:rPr>
+        <w:rFonts w:ascii="Symbol" w:hAnsi="Symbol" w:cs="Symbol" w:hint="default"/>
+      </w:rPr>
+    </w:lvl>
+    <w:lvl w:ilvl="4">
+      <w:start w:val="1"/>
+      <w:numFmt w:val="bullet"/>
+      <w:lvlText w:val=""/>
+      <w:lvlJc w:val="left"/>
+      <w:pPr>
+        <w:tabs>
+          <w:tab w:val="num" w:pos="1134"/>
+        </w:tabs>
+        <w:ind w:left="1134" w:hanging="227"/>
+      </w:pPr>
+      <w:rPr>
+        <w:rFonts w:ascii="Symbol" w:hAnsi="Symbol" w:cs="Symbol" w:hint="default"/>
+      </w:rPr>
+    </w:lvl>
+    <w:lvl w:ilvl="5">
+      <w:start w:val="1"/>
+      <w:numFmt w:val="bullet"/>
+      <w:lvlText w:val=""/>
+      <w:lvlJc w:val="left"/>
+      <w:pPr>
+        <w:tabs>
+          <w:tab w:val="num" w:pos="1361"/>
+        </w:tabs>
+        <w:ind w:left="1361" w:hanging="227"/>
+      </w:pPr>
+      <w:rPr>
+        <w:rFonts w:ascii="Symbol" w:hAnsi="Symbol" w:cs="Symbol" w:hint="default"/>
+      </w:rPr>
+    </w:lvl>
+    <w:lvl w:ilvl="6">
+      <w:start w:val="1"/>
+      <w:numFmt w:val="bullet"/>
+      <w:lvlText w:val=""/>
+      <w:lvlJc w:val="left"/>
+      <w:pPr>
+        <w:tabs>
+          <w:tab w:val="num" w:pos="1587"/>
+        </w:tabs>
+        <w:ind w:left="1587" w:hanging="227"/>
+      </w:pPr>
+      <w:rPr>
+        <w:rFonts w:ascii="Symbol" w:hAnsi="Symbol" w:cs="Symbol" w:hint="default"/>
+      </w:rPr>
+    </w:lvl>
+    <w:lvl w:ilvl="7">
+      <w:start w:val="1"/>
+      <w:numFmt w:val="bullet"/>
+      <w:lvlText w:val=""/>
+      <w:lvlJc w:val="left"/>
+      <w:pPr>
+        <w:tabs>
+          <w:tab w:val="num" w:pos="1814"/>
+        </w:tabs>
+        <w:ind w:left="1814" w:hanging="227"/>
+      </w:pPr>
+      <w:rPr>
+        <w:rFonts w:ascii="Symbol" w:hAnsi="Symbol" w:cs="Symbol" w:hint="default"/>
+      </w:rPr>
+    </w:lvl>
+    <w:lvl w:ilvl="8">
+      <w:start w:val="1"/>
+      <w:numFmt w:val="bullet"/>
+      <w:lvlText w:val=""/>
+      <w:lvlJc w:val="left"/>
+      <w:pPr>
+        <w:tabs>
+          <w:tab w:val="num" w:pos="2041"/>
+        </w:tabs>
+        <w:ind w:left="2041" w:hanging="227"/>
+      </w:pPr>
+      <w:rPr>
+        <w:rFonts w:ascii="Symbol" w:hAnsi="Symbol" w:cs="Symbol" w:hint="default"/>
+      </w:rPr>
+    </w:lvl>
+  </w:abstractNum>
+  <w:abstractNum w:abstractNumId="6">
+    <w:lvl w:ilvl="0">
+      <w:start w:val="1"/>
       <w:numFmt w:val="decimal"/>
       <w:lvlText w:val="%1."/>
       <w:lvlJc w:val="left"/>
@@ -8453,127 +9028,6 @@
           <w:tab w:val="num" w:pos="3572"/>
         </w:tabs>
         <w:ind w:left="3929" w:hanging="397"/>
-      </w:pPr>
-      <w:rPr/>
-    </w:lvl>
-  </w:abstractNum>
-  <w:abstractNum w:abstractNumId="6">
-    <w:lvl w:ilvl="0">
-      <w:start w:val="1"/>
-      <w:numFmt w:val="bullet"/>
-      <w:lvlText w:val=""/>
-      <w:lvlJc w:val="left"/>
-      <w:pPr>
-        <w:tabs>
-          <w:tab w:val="num" w:pos="360"/>
-        </w:tabs>
-        <w:ind w:left="360" w:hanging="360"/>
-      </w:pPr>
-      <w:rPr>
-        <w:rFonts w:ascii="Symbol" w:hAnsi="Symbol" w:cs="Symbol" w:hint="default"/>
-      </w:rPr>
-    </w:lvl>
-    <w:lvl w:ilvl="1">
-      <w:start w:val="1"/>
-      <w:numFmt w:val="decimal"/>
-      <w:lvlText w:val="%2."/>
-      <w:lvlJc w:val="left"/>
-      <w:pPr>
-        <w:tabs>
-          <w:tab w:val="num" w:pos="1080"/>
-        </w:tabs>
-        <w:ind w:left="1080" w:hanging="360"/>
-      </w:pPr>
-      <w:rPr/>
-    </w:lvl>
-    <w:lvl w:ilvl="2">
-      <w:start w:val="1"/>
-      <w:numFmt w:val="decimal"/>
-      <w:lvlText w:val="%3."/>
-      <w:lvlJc w:val="left"/>
-      <w:pPr>
-        <w:tabs>
-          <w:tab w:val="num" w:pos="1440"/>
-        </w:tabs>
-        <w:ind w:left="1440" w:hanging="360"/>
-      </w:pPr>
-      <w:rPr/>
-    </w:lvl>
-    <w:lvl w:ilvl="3">
-      <w:start w:val="1"/>
-      <w:numFmt w:val="decimal"/>
-      <w:lvlText w:val="%4."/>
-      <w:lvlJc w:val="left"/>
-      <w:pPr>
-        <w:tabs>
-          <w:tab w:val="num" w:pos="1800"/>
-        </w:tabs>
-        <w:ind w:left="1800" w:hanging="360"/>
-      </w:pPr>
-      <w:rPr/>
-    </w:lvl>
-    <w:lvl w:ilvl="4">
-      <w:start w:val="1"/>
-      <w:numFmt w:val="decimal"/>
-      <w:lvlText w:val="%5."/>
-      <w:lvlJc w:val="left"/>
-      <w:pPr>
-        <w:tabs>
-          <w:tab w:val="num" w:pos="2160"/>
-        </w:tabs>
-        <w:ind w:left="2160" w:hanging="360"/>
-      </w:pPr>
-      <w:rPr/>
-    </w:lvl>
-    <w:lvl w:ilvl="5">
-      <w:start w:val="1"/>
-      <w:numFmt w:val="decimal"/>
-      <w:lvlText w:val="%6."/>
-      <w:lvlJc w:val="left"/>
-      <w:pPr>
-        <w:tabs>
-          <w:tab w:val="num" w:pos="2520"/>
-        </w:tabs>
-        <w:ind w:left="2520" w:hanging="360"/>
-      </w:pPr>
-      <w:rPr/>
-    </w:lvl>
-    <w:lvl w:ilvl="6">
-      <w:start w:val="1"/>
-      <w:numFmt w:val="decimal"/>
-      <w:lvlText w:val="%7."/>
-      <w:lvlJc w:val="left"/>
-      <w:pPr>
-        <w:tabs>
-          <w:tab w:val="num" w:pos="2880"/>
-        </w:tabs>
-        <w:ind w:left="2880" w:hanging="360"/>
-      </w:pPr>
-      <w:rPr/>
-    </w:lvl>
-    <w:lvl w:ilvl="7">
-      <w:start w:val="1"/>
-      <w:numFmt w:val="decimal"/>
-      <w:lvlText w:val="%8."/>
-      <w:lvlJc w:val="left"/>
-      <w:pPr>
-        <w:tabs>
-          <w:tab w:val="num" w:pos="3240"/>
-        </w:tabs>
-        <w:ind w:left="3240" w:hanging="360"/>
-      </w:pPr>
-      <w:rPr/>
-    </w:lvl>
-    <w:lvl w:ilvl="8">
-      <w:start w:val="1"/>
-      <w:numFmt w:val="decimal"/>
-      <w:lvlText w:val="%9."/>
-      <w:lvlJc w:val="left"/>
-      <w:pPr>
-        <w:tabs>
-          <w:tab w:val="num" w:pos="3600"/>
-        </w:tabs>
-        <w:ind w:left="3600" w:hanging="360"/>
       </w:pPr>
       <w:rPr/>
     </w:lvl>
@@ -8586,9 +9040,9 @@
       <w:lvlJc w:val="left"/>
       <w:pPr>
         <w:tabs>
-          <w:tab w:val="num" w:pos="720"/>
+          <w:tab w:val="num" w:pos="360"/>
         </w:tabs>
-        <w:ind w:left="720" w:hanging="360"/>
+        <w:ind w:left="360" w:hanging="360"/>
       </w:pPr>
       <w:rPr>
         <w:rFonts w:ascii="Symbol" w:hAnsi="Symbol" w:cs="Symbol" w:hint="default"/>
@@ -8707,9 +9161,9 @@
       <w:lvlJc w:val="left"/>
       <w:pPr>
         <w:tabs>
-          <w:tab w:val="num" w:pos="1080"/>
+          <w:tab w:val="num" w:pos="720"/>
         </w:tabs>
-        <w:ind w:left="1080" w:hanging="360"/>
+        <w:ind w:left="720" w:hanging="360"/>
       </w:pPr>
       <w:rPr>
         <w:rFonts w:ascii="Symbol" w:hAnsi="Symbol" w:cs="Symbol" w:hint="default"/>
@@ -8823,16 +9277,18 @@
   <w:abstractNum w:abstractNumId="9">
     <w:lvl w:ilvl="0">
       <w:start w:val="1"/>
-      <w:numFmt w:val="decimal"/>
-      <w:lvlText w:val="%1."/>
+      <w:numFmt w:val="bullet"/>
+      <w:lvlText w:val=""/>
       <w:lvlJc w:val="left"/>
       <w:pPr>
         <w:tabs>
-          <w:tab w:val="num" w:pos="360"/>
+          <w:tab w:val="num" w:pos="1080"/>
         </w:tabs>
-        <w:ind w:left="360" w:hanging="360"/>
-      </w:pPr>
-      <w:rPr/>
+        <w:ind w:left="1080" w:hanging="360"/>
+      </w:pPr>
+      <w:rPr>
+        <w:rFonts w:ascii="Symbol" w:hAnsi="Symbol" w:cs="Symbol" w:hint="default"/>
+      </w:rPr>
     </w:lvl>
     <w:lvl w:ilvl="1">
       <w:start w:val="1"/>
@@ -8947,9 +9403,9 @@
       <w:lvlJc w:val="left"/>
       <w:pPr>
         <w:tabs>
-          <w:tab w:val="num" w:pos="720"/>
+          <w:tab w:val="num" w:pos="360"/>
         </w:tabs>
-        <w:ind w:left="720" w:hanging="360"/>
+        <w:ind w:left="360" w:hanging="360"/>
       </w:pPr>
       <w:rPr/>
     </w:lvl>
@@ -9066,9 +9522,9 @@
       <w:lvlJc w:val="left"/>
       <w:pPr>
         <w:tabs>
-          <w:tab w:val="num" w:pos="1080"/>
+          <w:tab w:val="num" w:pos="720"/>
         </w:tabs>
-        <w:ind w:left="1080" w:hanging="360"/>
+        <w:ind w:left="720" w:hanging="360"/>
       </w:pPr>
       <w:rPr/>
     </w:lvl>
@@ -9180,151 +9636,14 @@
   <w:abstractNum w:abstractNumId="12">
     <w:lvl w:ilvl="0">
       <w:start w:val="1"/>
-      <w:numFmt w:val="bullet"/>
-      <w:lvlText w:val=""/>
-      <w:lvlJc w:val="left"/>
-      <w:pPr>
-        <w:tabs>
-          <w:tab w:val="num" w:pos="227"/>
-        </w:tabs>
-        <w:ind w:left="227" w:hanging="227"/>
-      </w:pPr>
-      <w:rPr>
-        <w:rFonts w:ascii="Symbol" w:hAnsi="Symbol" w:cs="Symbol" w:hint="default"/>
-      </w:rPr>
-    </w:lvl>
-    <w:lvl w:ilvl="1">
-      <w:start w:val="1"/>
-      <w:numFmt w:val="bullet"/>
-      <w:lvlText w:val=""/>
-      <w:lvlJc w:val="left"/>
-      <w:pPr>
-        <w:tabs>
-          <w:tab w:val="num" w:pos="454"/>
-        </w:tabs>
-        <w:ind w:left="454" w:hanging="227"/>
-      </w:pPr>
-      <w:rPr>
-        <w:rFonts w:ascii="Symbol" w:hAnsi="Symbol" w:cs="Symbol" w:hint="default"/>
-      </w:rPr>
-    </w:lvl>
-    <w:lvl w:ilvl="2">
-      <w:start w:val="1"/>
-      <w:numFmt w:val="bullet"/>
-      <w:lvlText w:val=""/>
-      <w:lvlJc w:val="left"/>
-      <w:pPr>
-        <w:tabs>
-          <w:tab w:val="num" w:pos="680"/>
-        </w:tabs>
-        <w:ind w:left="680" w:hanging="227"/>
-      </w:pPr>
-      <w:rPr>
-        <w:rFonts w:ascii="Symbol" w:hAnsi="Symbol" w:cs="Symbol" w:hint="default"/>
-      </w:rPr>
-    </w:lvl>
-    <w:lvl w:ilvl="3">
-      <w:start w:val="1"/>
-      <w:numFmt w:val="bullet"/>
-      <w:lvlText w:val=""/>
-      <w:lvlJc w:val="left"/>
-      <w:pPr>
-        <w:tabs>
-          <w:tab w:val="num" w:pos="907"/>
-        </w:tabs>
-        <w:ind w:left="907" w:hanging="227"/>
-      </w:pPr>
-      <w:rPr>
-        <w:rFonts w:ascii="Symbol" w:hAnsi="Symbol" w:cs="Symbol" w:hint="default"/>
-      </w:rPr>
-    </w:lvl>
-    <w:lvl w:ilvl="4">
-      <w:start w:val="1"/>
-      <w:numFmt w:val="bullet"/>
-      <w:lvlText w:val=""/>
-      <w:lvlJc w:val="left"/>
-      <w:pPr>
-        <w:tabs>
-          <w:tab w:val="num" w:pos="1134"/>
-        </w:tabs>
-        <w:ind w:left="1134" w:hanging="227"/>
-      </w:pPr>
-      <w:rPr>
-        <w:rFonts w:ascii="Symbol" w:hAnsi="Symbol" w:cs="Symbol" w:hint="default"/>
-      </w:rPr>
-    </w:lvl>
-    <w:lvl w:ilvl="5">
-      <w:start w:val="1"/>
-      <w:numFmt w:val="bullet"/>
-      <w:lvlText w:val=""/>
-      <w:lvlJc w:val="left"/>
-      <w:pPr>
-        <w:tabs>
-          <w:tab w:val="num" w:pos="1361"/>
-        </w:tabs>
-        <w:ind w:left="1361" w:hanging="227"/>
-      </w:pPr>
-      <w:rPr>
-        <w:rFonts w:ascii="Symbol" w:hAnsi="Symbol" w:cs="Symbol" w:hint="default"/>
-      </w:rPr>
-    </w:lvl>
-    <w:lvl w:ilvl="6">
-      <w:start w:val="1"/>
-      <w:numFmt w:val="bullet"/>
-      <w:lvlText w:val=""/>
-      <w:lvlJc w:val="left"/>
-      <w:pPr>
-        <w:tabs>
-          <w:tab w:val="num" w:pos="1587"/>
-        </w:tabs>
-        <w:ind w:left="1587" w:hanging="227"/>
-      </w:pPr>
-      <w:rPr>
-        <w:rFonts w:ascii="Symbol" w:hAnsi="Symbol" w:cs="Symbol" w:hint="default"/>
-      </w:rPr>
-    </w:lvl>
-    <w:lvl w:ilvl="7">
-      <w:start w:val="1"/>
-      <w:numFmt w:val="bullet"/>
-      <w:lvlText w:val=""/>
-      <w:lvlJc w:val="left"/>
-      <w:pPr>
-        <w:tabs>
-          <w:tab w:val="num" w:pos="1814"/>
-        </w:tabs>
-        <w:ind w:left="1814" w:hanging="227"/>
-      </w:pPr>
-      <w:rPr>
-        <w:rFonts w:ascii="Symbol" w:hAnsi="Symbol" w:cs="Symbol" w:hint="default"/>
-      </w:rPr>
-    </w:lvl>
-    <w:lvl w:ilvl="8">
-      <w:start w:val="1"/>
-      <w:numFmt w:val="bullet"/>
-      <w:lvlText w:val=""/>
-      <w:lvlJc w:val="left"/>
-      <w:pPr>
-        <w:tabs>
-          <w:tab w:val="num" w:pos="2041"/>
-        </w:tabs>
-        <w:ind w:left="2041" w:hanging="227"/>
-      </w:pPr>
-      <w:rPr>
-        <w:rFonts w:ascii="Symbol" w:hAnsi="Symbol" w:cs="Symbol" w:hint="default"/>
-      </w:rPr>
-    </w:lvl>
-  </w:abstractNum>
-  <w:abstractNum w:abstractNumId="13">
-    <w:lvl w:ilvl="0">
-      <w:start w:val="1"/>
       <w:numFmt w:val="decimal"/>
       <w:lvlText w:val="%1."/>
       <w:lvlJc w:val="left"/>
       <w:pPr>
         <w:tabs>
-          <w:tab w:val="num" w:pos="709"/>
+          <w:tab w:val="num" w:pos="1080"/>
         </w:tabs>
-        <w:ind w:left="709" w:hanging="283"/>
+        <w:ind w:left="1080" w:hanging="360"/>
       </w:pPr>
       <w:rPr/>
     </w:lvl>
@@ -9335,9 +9654,9 @@
       <w:lvlJc w:val="left"/>
       <w:pPr>
         <w:tabs>
-          <w:tab w:val="num" w:pos="1418"/>
+          <w:tab w:val="num" w:pos="1080"/>
         </w:tabs>
-        <w:ind w:left="1418" w:hanging="283"/>
+        <w:ind w:left="1080" w:hanging="360"/>
       </w:pPr>
       <w:rPr/>
     </w:lvl>
@@ -9348,9 +9667,9 @@
       <w:lvlJc w:val="left"/>
       <w:pPr>
         <w:tabs>
-          <w:tab w:val="num" w:pos="2127"/>
+          <w:tab w:val="num" w:pos="1440"/>
         </w:tabs>
-        <w:ind w:left="2127" w:hanging="283"/>
+        <w:ind w:left="1440" w:hanging="360"/>
       </w:pPr>
       <w:rPr/>
     </w:lvl>
@@ -9361,9 +9680,9 @@
       <w:lvlJc w:val="left"/>
       <w:pPr>
         <w:tabs>
-          <w:tab w:val="num" w:pos="2836"/>
+          <w:tab w:val="num" w:pos="1800"/>
         </w:tabs>
-        <w:ind w:left="2836" w:hanging="283"/>
+        <w:ind w:left="1800" w:hanging="360"/>
       </w:pPr>
       <w:rPr/>
     </w:lvl>
@@ -9374,9 +9693,9 @@
       <w:lvlJc w:val="left"/>
       <w:pPr>
         <w:tabs>
-          <w:tab w:val="num" w:pos="3545"/>
+          <w:tab w:val="num" w:pos="2160"/>
         </w:tabs>
-        <w:ind w:left="3545" w:hanging="283"/>
+        <w:ind w:left="2160" w:hanging="360"/>
       </w:pPr>
       <w:rPr/>
     </w:lvl>
@@ -9387,9 +9706,9 @@
       <w:lvlJc w:val="left"/>
       <w:pPr>
         <w:tabs>
-          <w:tab w:val="num" w:pos="4254"/>
+          <w:tab w:val="num" w:pos="2520"/>
         </w:tabs>
-        <w:ind w:left="4254" w:hanging="283"/>
+        <w:ind w:left="2520" w:hanging="360"/>
       </w:pPr>
       <w:rPr/>
     </w:lvl>
@@ -9400,9 +9719,9 @@
       <w:lvlJc w:val="left"/>
       <w:pPr>
         <w:tabs>
-          <w:tab w:val="num" w:pos="4963"/>
+          <w:tab w:val="num" w:pos="2880"/>
         </w:tabs>
-        <w:ind w:left="4963" w:hanging="283"/>
+        <w:ind w:left="2880" w:hanging="360"/>
       </w:pPr>
       <w:rPr/>
     </w:lvl>
@@ -9413,9 +9732,9 @@
       <w:lvlJc w:val="left"/>
       <w:pPr>
         <w:tabs>
-          <w:tab w:val="num" w:pos="5672"/>
+          <w:tab w:val="num" w:pos="3240"/>
         </w:tabs>
-        <w:ind w:left="5672" w:hanging="283"/>
+        <w:ind w:left="3240" w:hanging="360"/>
       </w:pPr>
       <w:rPr/>
     </w:lvl>
@@ -9426,6 +9745,262 @@
       <w:lvlJc w:val="left"/>
       <w:pPr>
         <w:tabs>
+          <w:tab w:val="num" w:pos="3600"/>
+        </w:tabs>
+        <w:ind w:left="3600" w:hanging="360"/>
+      </w:pPr>
+      <w:rPr/>
+    </w:lvl>
+  </w:abstractNum>
+  <w:abstractNum w:abstractNumId="13">
+    <w:lvl w:ilvl="0">
+      <w:start w:val="1"/>
+      <w:numFmt w:val="bullet"/>
+      <w:lvlText w:val=""/>
+      <w:lvlJc w:val="left"/>
+      <w:pPr>
+        <w:tabs>
+          <w:tab w:val="num" w:pos="227"/>
+        </w:tabs>
+        <w:ind w:left="227" w:hanging="227"/>
+      </w:pPr>
+      <w:rPr>
+        <w:rFonts w:ascii="Symbol" w:hAnsi="Symbol" w:cs="Symbol" w:hint="default"/>
+      </w:rPr>
+    </w:lvl>
+    <w:lvl w:ilvl="1">
+      <w:start w:val="1"/>
+      <w:numFmt w:val="bullet"/>
+      <w:lvlText w:val=""/>
+      <w:lvlJc w:val="left"/>
+      <w:pPr>
+        <w:tabs>
+          <w:tab w:val="num" w:pos="454"/>
+        </w:tabs>
+        <w:ind w:left="454" w:hanging="227"/>
+      </w:pPr>
+      <w:rPr>
+        <w:rFonts w:ascii="Symbol" w:hAnsi="Symbol" w:cs="Symbol" w:hint="default"/>
+      </w:rPr>
+    </w:lvl>
+    <w:lvl w:ilvl="2">
+      <w:start w:val="1"/>
+      <w:numFmt w:val="bullet"/>
+      <w:lvlText w:val=""/>
+      <w:lvlJc w:val="left"/>
+      <w:pPr>
+        <w:tabs>
+          <w:tab w:val="num" w:pos="680"/>
+        </w:tabs>
+        <w:ind w:left="680" w:hanging="227"/>
+      </w:pPr>
+      <w:rPr>
+        <w:rFonts w:ascii="Symbol" w:hAnsi="Symbol" w:cs="Symbol" w:hint="default"/>
+      </w:rPr>
+    </w:lvl>
+    <w:lvl w:ilvl="3">
+      <w:start w:val="1"/>
+      <w:numFmt w:val="bullet"/>
+      <w:lvlText w:val=""/>
+      <w:lvlJc w:val="left"/>
+      <w:pPr>
+        <w:tabs>
+          <w:tab w:val="num" w:pos="907"/>
+        </w:tabs>
+        <w:ind w:left="907" w:hanging="227"/>
+      </w:pPr>
+      <w:rPr>
+        <w:rFonts w:ascii="Symbol" w:hAnsi="Symbol" w:cs="Symbol" w:hint="default"/>
+      </w:rPr>
+    </w:lvl>
+    <w:lvl w:ilvl="4">
+      <w:start w:val="1"/>
+      <w:numFmt w:val="bullet"/>
+      <w:lvlText w:val=""/>
+      <w:lvlJc w:val="left"/>
+      <w:pPr>
+        <w:tabs>
+          <w:tab w:val="num" w:pos="1134"/>
+        </w:tabs>
+        <w:ind w:left="1134" w:hanging="227"/>
+      </w:pPr>
+      <w:rPr>
+        <w:rFonts w:ascii="Symbol" w:hAnsi="Symbol" w:cs="Symbol" w:hint="default"/>
+      </w:rPr>
+    </w:lvl>
+    <w:lvl w:ilvl="5">
+      <w:start w:val="1"/>
+      <w:numFmt w:val="bullet"/>
+      <w:lvlText w:val=""/>
+      <w:lvlJc w:val="left"/>
+      <w:pPr>
+        <w:tabs>
+          <w:tab w:val="num" w:pos="1361"/>
+        </w:tabs>
+        <w:ind w:left="1361" w:hanging="227"/>
+      </w:pPr>
+      <w:rPr>
+        <w:rFonts w:ascii="Symbol" w:hAnsi="Symbol" w:cs="Symbol" w:hint="default"/>
+      </w:rPr>
+    </w:lvl>
+    <w:lvl w:ilvl="6">
+      <w:start w:val="1"/>
+      <w:numFmt w:val="bullet"/>
+      <w:lvlText w:val=""/>
+      <w:lvlJc w:val="left"/>
+      <w:pPr>
+        <w:tabs>
+          <w:tab w:val="num" w:pos="1587"/>
+        </w:tabs>
+        <w:ind w:left="1587" w:hanging="227"/>
+      </w:pPr>
+      <w:rPr>
+        <w:rFonts w:ascii="Symbol" w:hAnsi="Symbol" w:cs="Symbol" w:hint="default"/>
+      </w:rPr>
+    </w:lvl>
+    <w:lvl w:ilvl="7">
+      <w:start w:val="1"/>
+      <w:numFmt w:val="bullet"/>
+      <w:lvlText w:val=""/>
+      <w:lvlJc w:val="left"/>
+      <w:pPr>
+        <w:tabs>
+          <w:tab w:val="num" w:pos="1814"/>
+        </w:tabs>
+        <w:ind w:left="1814" w:hanging="227"/>
+      </w:pPr>
+      <w:rPr>
+        <w:rFonts w:ascii="Symbol" w:hAnsi="Symbol" w:cs="Symbol" w:hint="default"/>
+      </w:rPr>
+    </w:lvl>
+    <w:lvl w:ilvl="8">
+      <w:start w:val="1"/>
+      <w:numFmt w:val="bullet"/>
+      <w:lvlText w:val=""/>
+      <w:lvlJc w:val="left"/>
+      <w:pPr>
+        <w:tabs>
+          <w:tab w:val="num" w:pos="2041"/>
+        </w:tabs>
+        <w:ind w:left="2041" w:hanging="227"/>
+      </w:pPr>
+      <w:rPr>
+        <w:rFonts w:ascii="Symbol" w:hAnsi="Symbol" w:cs="Symbol" w:hint="default"/>
+      </w:rPr>
+    </w:lvl>
+  </w:abstractNum>
+  <w:abstractNum w:abstractNumId="14">
+    <w:lvl w:ilvl="0">
+      <w:start w:val="1"/>
+      <w:numFmt w:val="decimal"/>
+      <w:lvlText w:val="%1."/>
+      <w:lvlJc w:val="left"/>
+      <w:pPr>
+        <w:tabs>
+          <w:tab w:val="num" w:pos="709"/>
+        </w:tabs>
+        <w:ind w:left="709" w:hanging="283"/>
+      </w:pPr>
+      <w:rPr/>
+    </w:lvl>
+    <w:lvl w:ilvl="1">
+      <w:start w:val="1"/>
+      <w:numFmt w:val="decimal"/>
+      <w:lvlText w:val="%2."/>
+      <w:lvlJc w:val="left"/>
+      <w:pPr>
+        <w:tabs>
+          <w:tab w:val="num" w:pos="1418"/>
+        </w:tabs>
+        <w:ind w:left="1418" w:hanging="283"/>
+      </w:pPr>
+      <w:rPr/>
+    </w:lvl>
+    <w:lvl w:ilvl="2">
+      <w:start w:val="1"/>
+      <w:numFmt w:val="decimal"/>
+      <w:lvlText w:val="%3."/>
+      <w:lvlJc w:val="left"/>
+      <w:pPr>
+        <w:tabs>
+          <w:tab w:val="num" w:pos="2127"/>
+        </w:tabs>
+        <w:ind w:left="2127" w:hanging="283"/>
+      </w:pPr>
+      <w:rPr/>
+    </w:lvl>
+    <w:lvl w:ilvl="3">
+      <w:start w:val="1"/>
+      <w:numFmt w:val="decimal"/>
+      <w:lvlText w:val="%4."/>
+      <w:lvlJc w:val="left"/>
+      <w:pPr>
+        <w:tabs>
+          <w:tab w:val="num" w:pos="2836"/>
+        </w:tabs>
+        <w:ind w:left="2836" w:hanging="283"/>
+      </w:pPr>
+      <w:rPr/>
+    </w:lvl>
+    <w:lvl w:ilvl="4">
+      <w:start w:val="1"/>
+      <w:numFmt w:val="decimal"/>
+      <w:lvlText w:val="%5."/>
+      <w:lvlJc w:val="left"/>
+      <w:pPr>
+        <w:tabs>
+          <w:tab w:val="num" w:pos="3545"/>
+        </w:tabs>
+        <w:ind w:left="3545" w:hanging="283"/>
+      </w:pPr>
+      <w:rPr/>
+    </w:lvl>
+    <w:lvl w:ilvl="5">
+      <w:start w:val="1"/>
+      <w:numFmt w:val="decimal"/>
+      <w:lvlText w:val="%6."/>
+      <w:lvlJc w:val="left"/>
+      <w:pPr>
+        <w:tabs>
+          <w:tab w:val="num" w:pos="4254"/>
+        </w:tabs>
+        <w:ind w:left="4254" w:hanging="283"/>
+      </w:pPr>
+      <w:rPr/>
+    </w:lvl>
+    <w:lvl w:ilvl="6">
+      <w:start w:val="1"/>
+      <w:numFmt w:val="decimal"/>
+      <w:lvlText w:val="%7."/>
+      <w:lvlJc w:val="left"/>
+      <w:pPr>
+        <w:tabs>
+          <w:tab w:val="num" w:pos="4963"/>
+        </w:tabs>
+        <w:ind w:left="4963" w:hanging="283"/>
+      </w:pPr>
+      <w:rPr/>
+    </w:lvl>
+    <w:lvl w:ilvl="7">
+      <w:start w:val="1"/>
+      <w:numFmt w:val="decimal"/>
+      <w:lvlText w:val="%8."/>
+      <w:lvlJc w:val="left"/>
+      <w:pPr>
+        <w:tabs>
+          <w:tab w:val="num" w:pos="5672"/>
+        </w:tabs>
+        <w:ind w:left="5672" w:hanging="283"/>
+      </w:pPr>
+      <w:rPr/>
+    </w:lvl>
+    <w:lvl w:ilvl="8">
+      <w:start w:val="1"/>
+      <w:numFmt w:val="decimal"/>
+      <w:lvlText w:val="%9."/>
+      <w:lvlJc w:val="left"/>
+      <w:pPr>
+        <w:tabs>
           <w:tab w:val="num" w:pos="6381"/>
         </w:tabs>
         <w:ind w:left="6381" w:hanging="283"/>
@@ -9433,7 +10008,7 @@
       <w:rPr/>
     </w:lvl>
   </w:abstractNum>
-  <w:abstractNum w:abstractNumId="14">
+  <w:abstractNum w:abstractNumId="15">
     <w:lvl w:ilvl="0">
       <w:start w:val="1"/>
       <w:numFmt w:val="none"/>
@@ -9593,6 +10168,9 @@
   </w:num>
   <w:num w:numId="14">
     <w:abstractNumId w:val="14"/>
+  </w:num>
+  <w:num w:numId="15">
+    <w:abstractNumId w:val="15"/>
   </w:num>
 </w:numbering>
 </file>
@@ -10592,7 +11170,7 @@
     <w:pPr>
       <w:numPr>
         <w:ilvl w:val="0"/>
-        <w:numId w:val="8"/>
+        <w:numId w:val="9"/>
       </w:numPr>
       <w:spacing w:before="0" w:after="200"/>
       <w:contextualSpacing/>
@@ -10623,7 +11201,7 @@
     <w:pPr>
       <w:numPr>
         <w:ilvl w:val="0"/>
-        <w:numId w:val="6"/>
+        <w:numId w:val="7"/>
       </w:numPr>
       <w:spacing w:before="0" w:after="200"/>
       <w:contextualSpacing/>
@@ -10640,7 +11218,7 @@
     <w:pPr>
       <w:numPr>
         <w:ilvl w:val="0"/>
-        <w:numId w:val="7"/>
+        <w:numId w:val="8"/>
       </w:numPr>
       <w:spacing w:before="0" w:after="200"/>
       <w:contextualSpacing/>
@@ -10657,7 +11235,7 @@
     <w:pPr>
       <w:numPr>
         <w:ilvl w:val="0"/>
-        <w:numId w:val="9"/>
+        <w:numId w:val="10"/>
       </w:numPr>
       <w:spacing w:before="0" w:after="200"/>
       <w:contextualSpacing/>
@@ -10674,7 +11252,7 @@
     <w:pPr>
       <w:numPr>
         <w:ilvl w:val="0"/>
-        <w:numId w:val="10"/>
+        <w:numId w:val="11"/>
       </w:numPr>
       <w:spacing w:before="0" w:after="200"/>
       <w:contextualSpacing/>
@@ -10691,7 +11269,7 @@
     <w:pPr>
       <w:numPr>
         <w:ilvl w:val="0"/>
-        <w:numId w:val="11"/>
+        <w:numId w:val="12"/>
       </w:numPr>
       <w:spacing w:before="0" w:after="200"/>
       <w:contextualSpacing/>

</xml_diff>